<commit_message>
MVP PLOS ONE: Round-11 T0-1 + T1 fixes (bulk-support partition 313, pure 4/4=1707, nerve-injury downgrade, EPV, title single-source, LPL FDR, REG3B framing, Zenodo placeholder->GitHub); v1.1.0
</commit_message>
<xml_diff>
--- a/submission_pack/Manuscript.docx
+++ b/submission_pack/Manuscript.docx
@@ -357,7 +357,7 @@
           <w:i w:val="0"/>
           <w:sz w:val="22"/>
         </w:rPr>
-        <w:t>Gene-set statistics, now corrected across sets, revealed a coordinated, polarity-opposed programme (Fig. 1). With Benjamini–Hochberg correction applied across the 18 multi-member sets (the single-member Sigma-1 marker excluded from set-level inference), neuroinflammation (mean_Z +4.94, 100% up, permutation q = 0.003), DAM-like neuroimmune programme (+3.88, 93.8% up, q = 0.003) and complement (+3.44, 94.4% up, q = 0.003) were coordinately upregulated, and mitochondrial OXPHOS was downregulated (mean_Z −2.37, 73.7% of members down, q = 0.020). These three programmes share many members (e.g. C1QA/B/C appear in both complement and the DAM-like set, and cytokines such as IL6/TNF/CCL2 in both neuroinflammation and DAM-like), so the effective number of independent discoveries is close to one; we therefore report them as a single coordinated neuroimmune–complement axis rather than three independent programmes. Because 2,000 permutations impose a resolution floor of 1/2001 ≈ 0.0005, permutation p-values at or below that floor are reported as an upper bound, and sets are ordered by Stouffer Z rather than by sub-floor p. Under the random-effects meta-vector the three upregulated programmes survived (q = 0.003 each) but OXPHOS did not (q = 0.31), so energy-metabolism suppression is reported as a fixed-effect finding that is not reliable under between-contrast heterogeneity. Because this is a bulk-tissue gene-set signal, it cannot be attributed specifically to resident microglia versus infiltrating macrophages or other neuroimmune cells; "DAM-like" denotes the shared transcriptional programme, not a cell-type-resolved state. Consistent with this qualification, LPL — a canonical DAM hallmark that is up-regulated in bona fide DAM — is itself down-regulated in the nerve-injury meta (meta_Z −3.43, FDR 6.1×10⁻⁴), so the "DAM-like" label captures the complement/immune-activation pole of the programme and should not be read as a complete DAM state. Broad ion-channel families did not change coordinately at the family-aggregate level (Nav_SCN q = 0.44; TRP q = 0.89; CACNA q = 0.85; Kv/KCNQ q = 0.85). The specific nociceptor sodium channels SCN9A, SCN10A, SCN11A and SCN8A were individually significant and directionally down-regulated in the nerve-injury contrasts (see the SCN direction table below), but were excluded from docking as structurally undockable.</w:t>
+        <w:t>Gene-set statistics, now corrected across sets, revealed a coordinated, polarity-opposed programme (Fig. 1). With Benjamini–Hochberg correction applied across the 18 multi-member sets (the single-member Sigma-1 marker excluded from set-level inference), neuroinflammation (mean_Z +4.94, 100% up, permutation q = 0.003), DAM-like neuroimmune programme (+3.88, 93.8% up, q = 0.003) and complement (+3.44, 94.4% up, q = 0.003) were coordinately upregulated, and mitochondrial OXPHOS was downregulated (mean_Z −2.37, 73.7% of members down, q = 0.020). These three programmes share many members (e.g. C1QA/B/C appear in both complement and the DAM-like set, and cytokines such as IL6/TNF/CCL2 in both neuroinflammation and DAM-like), so the effective number of independent discoveries is close to one; we therefore report them as a single coordinated neuroimmune–complement axis rather than three independent programmes. Because 2,000 permutations impose a resolution floor of 1/2001 ≈ 0.0005, permutation p-values at or below that floor are reported as an upper bound, and sets are ordered by Stouffer Z rather than by sub-floor p. Under the random-effects meta-vector the three upregulated programmes survived (q = 0.003 each) but OXPHOS did not (q = 0.31), so energy-metabolism suppression is reported as a fixed-effect finding that is not reliable under between-contrast heterogeneity. Because this is a bulk-tissue gene-set signal, it cannot be attributed specifically to resident microglia versus infiltrating macrophages or other neuroimmune cells; "DAM-like" denotes the shared transcriptional programme, not a cell-type-resolved state. Consistent with this qualification, LPL — a canonical DAM hallmark that is up-regulated in bona fide DAM — is itself down-regulated in the nerve-injury meta (meta_Z −3.43, two-sided p = 6.1×10⁻⁴, BH-FDR 2.6×10⁻³), so the "DAM-like" label captures the complement/immune-activation pole of the programme and should not be read as a complete DAM state. Broad ion-channel families did not change coordinately at the family-aggregate level (Nav_SCN q = 0.44; TRP q = 0.89; CACNA q = 0.85; Kv/KCNQ q = 0.85). The specific nociceptor sodium channels SCN9A, SCN10A, SCN11A and SCN8A were individually significant and directionally down-regulated in the nerve-injury contrasts (see the SCN direction table below), but were excluded from docking as structurally undockable.</w:t>
       </w:r>
     </w:p>
     <w:p>
@@ -398,7 +398,7 @@
           <w:i w:val="0"/>
           <w:sz w:val="22"/>
         </w:rPr>
-        <w:t xml:space="preserve"> (Xtail log2FC) rather than a bulk transcriptome, mixed with bulk-transcriptome meta_Z from the other studies, we repeated the meta-analysis on the four bulk studies only. This bulk-only meta-analysis defined a core of 2,512 genes (the same union-K≥3 inclusion rule as the primary — a gene was retained if present in ≥3 of the four bulk contrasts — so the sensitivity is method-identical to the six-input analysis except for the removal of the translatome study), of which 2,202 (54.3%) overlapped the primary 4,055-gene core. The 54.3% figure is the conservative, threshold-strict overlap: it applies the same directional-consistency gate the six-input core applies at ≥5/6 (all four bulk contrasts concordant, 4/4). When the same concordance proportion is required of the four-contrast set (≥3/4 — the largest achievable majority concordance for four contrasts, versus ≥5/6 ≈ 0.83 for six), the overlap rises to 3,587/4,055 = 88.5%; 1,385 of the 1,853 genes that appear lost under the strict 4/4 gate are recovered, and only 211 of the 4,055 primary-core genes are not bulk-significant at all (the genuine translatome-specific contribution to membership). The apparent 45.7% "translatome-dependence" of gene-level membership is therefore substantially a threshold/concordance-count artefact rather than a disappearance of the axis, and we report it as such rather than as a primary fragility. (An earlier, more restrictive all-four-present count of 1,981 is superseded by this method-identical definition.) The neuroimmune programme nonetheless survived: neuroinflammation (mean_Z +5.13, 100% up, perm p ≤ 0.0005), DAM microglia (+3.96, 87.5% up, perm p ≤ 0.0005), complement (+3.54, 93.8% up, perm p ≤ 0.0005) and OXPHOS (−2.80, 72.2% of members down, perm p ≤ 0.0005, polarity-opposed). As in the primary meta, no ion-channel family was coordinately changed (Nav_SCN perm p = 0.268; P2RX/P2RY perm p = 0.339; TRP 0.917; CACNA 0.827). We therefore report the </w:t>
+        <w:t xml:space="preserve"> (Xtail log2FC) rather than a bulk transcriptome, mixed with bulk-transcriptome meta_Z from the other studies, we repeated the meta-analysis on the four bulk studies only. This bulk-only meta-analysis (four bulk studies) defined a core of 2,512 genes under the same union-K≥3 inclusion rule as the primary (a gene retained if present in ≥3 of the four bulk contrasts, with bulk meta_FDR &lt; 0.05 and consistency ≥ 0.8), of which 2,202 (54.3%) overlapped the primary 4,055-gene core. The 54.3% figure is the conservative, threshold-strict overlap: it is the primary core ∩ bulk-significant core, where the bulk core applies consistency ≥ 0.8. Within that 2,202 overlap, 1,707 genes are concordant across all four bulk contrasts (pure 4/4) and 495 are concordant in exactly 3 of 4 (K = 3); the overlap is therefore more precisely described as ≥3/4 concordance, not as strict 4/4. When the bulk consistency gate is relaxed from ≥0.8 to ≥3/4 — the largest achievable majority concordance for four contrasts, versus ≥5/6 ≈ 0.83 for six — the overlap rises to 3,587/4,055 = 88.5%, recovering 1,385 of the 1,853 genes that appear lost under the stricter gate. Of the 4,055 primary-core genes, 313 lack any bulk-study support: 211 are present in the four-bulk file but not bulk-significant (bulk meta_FDR ≥ 0.05) and 102 are absent from the four-bulk file entirely (never evaluated by the bulk analysis); the remaining 468 fall outside even the relaxed ≥3/4 overlap. The translatome-specific contribution to core membership is therefore bounded by 211 (present-but-non-significant) to 313 (including never-bulk-tested), and the apparent 45.7% "translatome-dependence" of gene-level membership is substantially a threshold/concordance-count artefact rather than a disappearance of the axis. (An earlier, more restrictive all-four-present count of 1,981 is superseded by this method-identical definition.) The neuroimmune programme nonetheless survived: neuroinflammation (mean_Z +5.13, 100% up, perm p ≤ 0.0005), DAM microglia (+3.96, 87.5% up, perm p ≤ 0.0005), complement (+3.54, 93.8% up, perm p ≤ 0.0005) and OXPHOS (−2.80, 72.2% of members down, perm p ≤ 0.0005, polarity-opposed). As in the primary meta, no ion-channel family was coordinately changed (Nav_SCN perm p = 0.268; P2RX/P2RY perm p = 0.339; TRP 0.917; CACNA 0.827). We therefore report the </w:t>
       </w:r>
       <w:r>
         <w:rPr>
@@ -613,7 +613,7 @@
           <w:i w:val="0"/>
           <w:sz w:val="22"/>
         </w:rPr>
-        <w:t xml:space="preserve">Honest evaluation confirmed a nerve-injury-specific — not universally generalisable — LODO signal (Fig. 2A). Under leakage-controlled leave-one-dataset-out, four of the five folds reached AUC 1.000 (GSE278227 CCI rat DRG, n = 28; GSE212311 CCI, n = 6; and the two same-animal GSE241361 folds — mouse DRG AUC 1.000, n = 9; spinal cord AUC 1.000, n = 9 — which are excluded from the cross-animal mean); the two genuinely independent cross-animal nerve-injury folds are GSE278227 (n = 28) and GSE212311 (n = 6), both at AUC 1.000, and the nerve-injury-specific — not universal — conclusion rests on this pattern rather than on a quoted cross-animal mean. GSE212311 is a 3-versus-3 design (n = 6); under complete class separation its exact two-sided Mann–Whitney p is 0.10 (one-sided 0.05), the minimum attainable for that sample size, so its AUC 1.0 is the statistical floor of the design rather than independent evidence, and the cross-animal nerve-injury-specific conclusion rests principally on GSE278227 (n = 28). The signature does not generalise to the incision model: the pivotal incision fold (GSE267799 n = 20) falls to a leakage-controlled 0.677 [0.374, 0.940], a confidence interval that includes chance, so it neither confirms nor refutes incision generalisation; the nerve-injury-specific framing of the axis therefore rests on the nerve-injury folds rather than on a demonstrated failure of incision generalisation. Leave-one-dataset-out (LODO) cross-validation was the primary generalisation metric. For the cross-animal held-out datasets the raw (non-leakage) classifier AUC was 1.000 for GSE278227 (n = 28) and GSE212311 (n = 6), and 0.917 [0.729, 1.000] for GSE267799 (n = 20, the incision arm); the two GSE241361 tests (mouse DRG AUC 1.000, n = 9; spinal cord AUC 0.950 [0.709, 1.000], n = 9, raw non-leakage; the leakage-controlled value is 1.000) come from the same animals and are excluded from the cross-animal mean. A leakage-controlled re-estimation (feature selection recomputed out-of-fold; </w:t>
+        <w:t xml:space="preserve">Honest evaluation identified a candidate nerve-injury-enriched — not universally generalisable — LODO signal (Fig. 2A), with explicit precision caveats (below). Under leakage-controlled leave-one-dataset-out, four of the five folds reached AUC 1.000 (GSE278227 CCI rat DRG, n = 28; GSE212311 CCI, n = 6; and the two same-animal GSE241361 folds — mouse DRG AUC 1.000, n = 9; spinal cord AUC 1.000, n = 9 — which are excluded from the cross-animal mean); the two genuinely independent cross-animal nerve-injury folds are GSE278227 (n = 28) and GSE212311 (n = 6), both at AUC 1.000, and the candidate nerve-injury-enriched — not universal — conclusion rests on this pattern rather than on a quoted cross-animal mean. GSE212311 is a 3-versus-3 design (n = 6); under complete class separation its exact two-sided Mann–Whitney p is 0.10 (one-sided 0.05), the minimum attainable for that sample size, so its AUC 1.0 is the statistical floor of the design rather than independent evidence, and the cross-animal nerve-injury-enriched conclusion rests principally on GSE278227 (n = 28). The signature does not generalise to the incision model: the pivotal incision fold (GSE267799 n = 20) falls to a leakage-controlled 0.677 [0.374, 0.940], a confidence interval that includes chance, so it neither confirms nor refutes incision generalisation; the candidate nerve-injury-enriched framing of the axis therefore rests on the nerve-injury folds rather than on a demonstrated failure of incision generalisation. Leave-one-dataset-out (LODO) cross-validation was the primary generalisation metric. For the cross-animal held-out datasets the raw (non-leakage) classifier AUC was 1.000 for GSE278227 (n = 28) and GSE212311 (n = 6), and 0.917 [0.729, 1.000] for GSE267799 (n = 20, the incision arm); the two GSE241361 tests (mouse DRG AUC 1.000, n = 9; spinal cord AUC 0.950 [0.709, 1.000], n = 9, raw non-leakage; the leakage-controlled value is 1.000) come from the same animals and are excluded from the cross-animal mean. A leakage-controlled re-estimation (feature selection recomputed out-of-fold; </w:t>
       </w:r>
       <w:r>
         <w:rPr>
@@ -793,25 +793,7 @@
           <w:i w:val="0"/>
           <w:sz w:val="22"/>
         </w:rPr>
-        <w:t xml:space="preserve">Not every hub carries prior pain/DRG evidence, and several are annotation outliers that we flag rather than conceal. CDHR5 (intestinal epithelial cadherin), ANKRD1 (cardiac ankyrin-repeat protein, CARP), FLNC (muscle filamin C), CRISP3 (secretory/granule protein), and MEGF11 (retinal/spinal-development transmembrane protein) have no established DRG- or pain-role. CDHR5 is the strongest single illustration: it reached full three-method consensus and is consistently up-regulated in all four bulk contrasts (log₂FC +0.07 to +2.62, the largest contribution coming from GSE278227), so it is not a single-study artefact, yet its annotated biology is intestinal-epithelial and no DRG or pain role is established, we therefore treat it as a watch-list annotation outlier pending orthogonal confirmation rather than as a finding or biological candidate. Among hubs with established DRG-injury or pain evidence are ATF3, SPRR1A, ECEL1, NPY, VIP and (externally motivated) REG3B. We stress that REG3B is an external motivational hypothesis, not an internal-supporting hub: in this study REG3B was </w:t>
-      </w:r>
-      <w:r>
-        <w:rPr>
-          <w:rFonts w:ascii="Times New Roman" w:hAnsi="Times New Roman"/>
-          <w:b w:val="0"/>
-          <w:i/>
-          <w:sz w:val="22"/>
-        </w:rPr>
-        <w:t>not</w:t>
-      </w:r>
-      <w:r>
-        <w:rPr>
-          <w:rFonts w:ascii="Times New Roman" w:hAnsi="Times New Roman"/>
-          <w:b w:val="0"/>
-          <w:i w:val="0"/>
-          <w:sz w:val="22"/>
-        </w:rPr>
-        <w:t xml:space="preserve"> in the meta core, was not localisable in spinal snRNA, and showed only 1.7% detection in DRG; its "established DRG neuroimmune hub" status derives solely from a single CRPS-I (not CPSP, not nerve-transection) report¹⁹ and must be tested in the present model before any weight is attached.</w:t>
+        <w:t>Not every hub carries prior pain/DRG evidence, and several are annotation outliers that we flag rather than conceal. CDHR5 (intestinal epithelial cadherin), ANKRD1 (cardiac ankyrin-repeat protein, CARP), FLNC (muscle filamin C), CRISP3 (secretory/granule protein), and MEGF11 (retinal/spinal-development transmembrane protein) have no established DRG- or pain-role. CDHR5 is the strongest single illustration: it reached full three-method consensus and is consistently up-regulated in all four bulk contrasts (log₂FC +0.07 to +2.62, the largest contribution coming from GSE278227), so it is not a single-study artefact, yet its annotated biology is intestinal-epithelial and no DRG or pain role is established, we therefore treat it as a watch-list annotation outlier pending orthogonal confirmation rather than as a finding or biological candidate. Among hubs with established DRG-injury or pain evidence are ATF3, SPRR1A, ECEL1, NPY and VIP. REG3B — whose "established DRG neuroimmune hub" status derives largely from a single CRPS-I report¹⁹ (not CPSP, not nerve-transection) — is meta-significant in the present analysis (six-input Stouffer FDR 7.1×10⁻¹⁴; nerve-injury-only FDR 2.1×10⁻²⁰) yet fails the core's direction-consistency gate (consistency 0.75; down in 1 of 4 contrasts) and was not localisable in spinal snRNA and only 1.7% detected in DRG; we therefore carry it as an external motivational hypothesis rather than as a core internal hub, and it must be tested in the present model before weight is attached.</w:t>
       </w:r>
     </w:p>
     <w:p>
@@ -2874,7 +2856,7 @@
           <w:i w:val="0"/>
           <w:sz w:val="22"/>
         </w:rPr>
-        <w:t>The dual-ML candidate hub set (35 genes; 91% overlapping the meta core) is not a list of "new" genes, ATF3, SPRR1A, NPY, VIP and others are well-established DRG injury markers⁴,⁵,³⁴. Our contribution is the convergence and prioritisation across independent computational routes under leakage control, and the multi-cellular/spatial localisation showing the programme spans DRG injured neurons and spinal neuron/microglia/astrocyte/OPC compartments, with 17 of 33 detectably expressed hubs anatomically present in the dorsal horn at baseline. We flag REG3B as an external hypothesis only (model-mismatched evidence¹⁹) and the purinergic self-negative (P2RX/P2RY perm p = 0.339) as a boundary on the DAM interpretation.</w:t>
+        <w:t>The dual-ML candidate hub set (35 genes; 91% overlapping the meta core) is not a list of "new" genes, ATF3, SPRR1A, NPY, VIP and others are well-established DRG injury markers⁴,⁵,³⁴. Our contribution is the convergence and prioritisation across independent computational routes under leakage control, and the multi-cellular/spatial localisation showing the programme spans DRG injured neurons and spinal neuron/microglia/astrocyte/OPC compartments, with 17 of 33 detectably expressed hubs anatomically present in the dorsal horn at baseline. We flag REG3B as a strong meta-significant but consistency-failing candidate, carried as an external motivational hypothesis (model-mismatched evidence¹⁹) rather than as a core internal hub, and the purinergic self-negative (P2RX/P2RY perm p = 0.339) as a boundary on the DAM interpretation.</w:t>
       </w:r>
     </w:p>
     <w:p>
@@ -3223,7 +3205,7 @@
           <w:i w:val="0"/>
           <w:sz w:val="22"/>
         </w:rPr>
-        <w:t xml:space="preserve"> A collapse-sensitivity meta-analysis merged GSE265957's two timepoints into a single contrast (five inputs); a bulk-only meta-analysis excluded GSE265957 entirely (four bulk studies; the same union-K≥3 definition as the primary was applied, so the sensitivity is method-identical to the six-input analysis except for the removal of the translatome study; core = 2,512; overlap with the six-input core = 2,202/4,055 = 54.3% under the strict 4/4 concordance gate (the same ≥5/6 gate the primary core applies); applying the same concordance proportion to the four-contrast set, ≥3/4, gives 3,587/4,055 = 88.5%, with only 211 primary-core genes not bulk-significant at all; an earlier all-four-present (intersection) count of 1,981 is superseded). </w:t>
+        <w:t xml:space="preserve"> A collapse-sensitivity meta-analysis merged GSE265957's two timepoints into a single contrast (five inputs); a bulk-only meta-analysis excluded GSE265957 entirely (four bulk studies; the same union-K≥3 definition as the primary was applied, so the sensitivity is method-identical to the six-input analysis except for the removal of the translatome study; core = 2,512 (union-K≥3 with bulk meta_FDR &lt; 0.05 and consistency ≥ 0.8); overlap with the six-input core = 2,202/4,055 = 54.3%, the primary core ∩ bulk-significant core under the bulk core's own consistency ≥ 0.8 gate (of which 1,707 are pure 4/4 and 495 are K = 3 only); applying the relaxed ≥3/4 concordance gate to the four-contrast set gives 3,587/4,055 = 88.5%, recovering 1,385 of the 1,853 genes outside the stricter overlap, with 313 primary-core genes lacking any bulk-study support (211 present-but-non-significant plus 102 absent from the four-bulk file); an earlier all-four-present (intersection) count of 1,981 is superseded). </w:t>
       </w:r>
       <w:r>
         <w:rPr>
@@ -3297,7 +3279,7 @@
           <w:i w:val="0"/>
           <w:sz w:val="22"/>
         </w:rPr>
-        <w:t xml:space="preserve">Five DRG-axis datasets (GSE278227, GSE267799, GSE241361 mouse DRG, GSE241361 mouse spinal cord, GSE212311) were intra-dataset gene-z-scored, intersected to 13,208 common genes, and pooled into 72 samples. Univariate t pre-screening (Top 800) fed three feature selectors: LASSO (λ.min, bootstrap B=100), Random Forest mean-decrease-Gini (Top 80), and XGBoost |SHAP| (Top 80). A gene was a hub if ≥2/3 methods agreed. Generalisation was assessed primarily by leave-one-dataset-out (LODO) AUC; the cross-animal mean (raw, non-leakage) excludes the two GSE241361 folds, which are drawn from the same animals and are reported separately (raw cross-animal range 0.917–1.000 across three folds: GSE278227, GSE212311, and the incision arm GSE267799). Four of the five leakage-controlled folds yield degenerate DeLong intervals ([1.0, 1.0]) at small test n; only the incision fold yields an estimable CI; these are reported as non-informative rather than as evidence of perfect precision. A pooled within-dataset 5×20 repeated stratified cross-validation (0.999) is reported only as a leakage-inflated optimistic upper bound, alongside a label-permutation null (0.490 ± 0.085); the repeated-CV and permutation-null statistics are computed in </w:t>
+        <w:t xml:space="preserve">Five DRG-axis datasets (GSE278227, GSE267799, GSE241361 mouse DRG, GSE241361 mouse spinal cord, GSE212311) were intra-dataset gene-z-scored, intersected to 13,208 common genes, and pooled into 72 samples. Univariate t pre-screening (Top 800) fed three feature selectors: LASSO (λ.min, bootstrap B=100), Random Forest mean-decrease-Gini (Top 80), and XGBoost |SHAP| (Top 80). A gene was a hub if ≥2/3 methods agreed. Because the classifiers select 139–164 features against n = 6–28 test samples (events-per-parameter ≪ 1), they are used as candidate-generation screens, not calibrated precision estimates; their AUCs are reported as directional signals whose absolute precision is not estimable at these sample sizes. Generalisation was assessed primarily by leave-one-dataset-out (LODO) AUC; the cross-animal mean (raw, non-leakage) excludes the two GSE241361 folds, which are drawn from the same animals and are reported separately (raw cross-animal range 0.917–1.000 across three folds: GSE278227, GSE212311, and the incision arm GSE267799). Four of the five leakage-controlled folds yield degenerate DeLong intervals ([1.0, 1.0]) at small test n; only the incision fold yields an estimable CI; these are reported as non-informative rather than as evidence of perfect precision. A pooled within-dataset 5×20 repeated stratified cross-validation (0.999) is reported only as a leakage-inflated optimistic upper bound, alongside a label-permutation null (0.490 ± 0.085); the repeated-CV and permutation-null statistics are computed in </w:t>
       </w:r>
       <w:r>
         <w:rPr>
@@ -5675,7 +5657,7 @@
           <w:i w:val="0"/>
           <w:sz w:val="22"/>
         </w:rPr>
-        <w:t xml:space="preserve">All code, tables and figures are version-controlled in the public GitHub repository at https://github.com/yyx-4113/cpsp-drg-spinal-repurposing. The 12 primary GEO accessions analysed here (GSE267799, GSE212311, GSE278227, GSE241361, GSE265957, GSE158825, GSE222979, GSE216039, GSE328175, GSE246288, GSE306403, GSE325938) are public and available from GEO. At submission the repository will be released as version v1.0.0 (README + CITATION.cff + MIT LICENSE + reproduction scripts), and the derived tables enumerated below and in MANIFEST.sha256 will be included in that release: meta-analysis tables, gene-set statistics with set-level correction, hub lists, docking scores, single-cell/spatial localisation tables, the bulk-only sensitivity output </w:t>
+        <w:t xml:space="preserve">All code, tables and figures are version-controlled in the public GitHub repository at https://github.com/yyx-4113/cpsp-drg-spinal-repurposing. The 12 primary GEO accessions analysed here (GSE267799, GSE212311, GSE278227, GSE241361, GSE265957, GSE158825, GSE222979, GSE216039, GSE328175, GSE246288, GSE306403, GSE325938) are public and available from GEO. At submission the repository is released as version v1.0.0 (README + CITATION.cff + MIT LICENSE + reproduction scripts), and the derived tables enumerated below and in MANIFEST.sha256 are included in that release: meta-analysis tables, gene-set statistics with set-level correction, hub lists, docking scores, single-cell/spatial localisation tables, the bulk-only sensitivity output </w:t>
       </w:r>
       <w:r>
         <w:rPr>
@@ -5815,7 +5797,7 @@
           <w:i w:val="0"/>
           <w:sz w:val="22"/>
         </w:rPr>
-        <w:t>A versioned Zenodo archive will be deposited at submission and will receive a citable DOI at that point (10.5281/zenodo.XXXXXXX, minted upon deposit). The Zenodo archive and the GitHub release v1.0.0 are created together at submission; the Zenodo record archives the exact v1.0.0 repository snapshot.</w:t>
+        <w:t>The GitHub repository referenced above is released as a versioned, citable archive (v1.0.0; integrity verifiable via MANIFEST.sha256 and the accompanying CITATION.cff); no Zenodo snapshot has been deposited. Data are therefore available from the versioned GitHub release, not on request.</w:t>
       </w:r>
     </w:p>
     <w:p>
@@ -6504,7 +6486,7 @@
           <w:i w:val="0"/>
           <w:sz w:val="22"/>
         </w:rPr>
-        <w:t>(a) Inputs and core: 5 independent studies / 6 contrasts; 16,552 genes tested; 6,869 at meta_FDR &lt; 0.05; core = 4,055 (meta_FDR &lt; 0.05 and consistency ≥ 0.8). Random-effects sensitivity (DerSimonian–Laird; median τ² = 0.232, median I² = 38.8%): core = 1,008 (24.9% of the fixed-effect core). Collapse-sensitivity (5 inputs): core 4,294, retained 3,707/4,055 = 91.4%. Bulk-only sensitivity (4 bulk studies, translatome excluded; same union-K≥3 definition as primary): core 2,512; overlap with primary core 2,202/4,055 = 54.3% under the strict 4/4 concordance gate, rising to 3,587/4,055 = 88.5% under the threshold-relaxed ≥3/4 gate; only 211 primary-core genes are not bulk-significant at all, so gene-level membership is threshold-sensitive while the coordinated programme is robust.</w:t>
+        <w:t>(a) Inputs and core: 5 independent studies / 6 contrasts; 16,552 genes tested; 6,869 at meta_FDR &lt; 0.05; core = 4,055 (meta_FDR &lt; 0.05 and consistency ≥ 0.8). Random-effects sensitivity (DerSimonian–Laird; median τ² = 0.232, median I² = 38.8%): core = 1,008 (24.9% of the fixed-effect core). Collapse-sensitivity (5 inputs): core 4,294, retained 3,707/4,055 = 91.4%. Bulk-only sensitivity (4 bulk studies, translatome excluded; same union-K≥3 definition as primary): core 2,512; overlap with primary core 2,202/4,055 = 54.3% under the bulk core's consistency ≥ 0.8 gate (1,707 pure 4/4, 495 K = 3 only), rising to 3,587/4,055 = 88.5% under the threshold-relaxed ≥3/4 gate; of the 4,055 primary-core genes, 313 lack any bulk-study support (211 present-but-non-significant in the four-bulk file plus 102 absent from it), and 468 fall outside even the relaxed overlap, so gene-level membership is threshold-sensitive while the coordinated programme is robust.</w:t>
       </w:r>
     </w:p>
     <w:p>

</xml_diff>

<commit_message>
MVP PLOS ONE: Round-12 T0-1+T1+T2+T3 fixes + reference-order renumber + MANIFEST; v1.3.0
</commit_message>
<xml_diff>
--- a/submission_pack/Manuscript.docx
+++ b/submission_pack/Manuscript.docx
@@ -102,7 +102,7 @@
           <w:i w:val="0"/>
           <w:sz w:val="22"/>
         </w:rPr>
-        <w:t xml:space="preserve"> Chronic postsurgical pain affects 10–50% of surgical patients, yet DRG–spinal-axis targets remain undefined. We reanalysed 12 public GEO datasets (four nerve-injury, one incision), framing the axis as a nerve-injury-associated response and the incision arm as a held-out translation test.</w:t>
+        <w:t xml:space="preserve"> Chronic postsurgical pain affects 10–50% of surgical patients, yet DRG-centred nerve-injury targets and their spinal-cord localisation remain incompletely defined. We reanalysed 12 public GEO accessions, of which 5 transcriptomic studies (6 contrasts: four nerve-injury, one incision) inform the Stouffer meta-analysis and 7 provide single-cell/spatial/miRNA localisation plus the human plasma layer; we framed the nerve-injury signature as a nerve-injury-associated response and the incision arm as a held-out translation test.</w:t>
       </w:r>
     </w:p>
     <w:p>
@@ -125,7 +125,7 @@
           <w:i w:val="0"/>
           <w:sz w:val="22"/>
         </w:rPr>
-        <w:t xml:space="preserve"> We integrated 12 GEO datasets by Stouffer meta-analysis, set-level BH-corrected gene-set tests, dual-ML hub identification under leakage-controlled leave-one-dataset-out, and a full-library (3,085-drug) docking screen with reverse positive controls.</w:t>
+        <w:t xml:space="preserve"> We integrated the 5 transcriptomic studies (6 contrasts) by Stouffer meta-analysis, set-level BH-corrected gene-set tests, dual-ML hub identification under leakage-controlled leave-one-dataset-out, and a full-library (3,085-drug) docking screen with reverse positive controls.</w:t>
       </w:r>
     </w:p>
     <w:p>
@@ -199,7 +199,7 @@
           <w:i w:val="0"/>
           <w:sz w:val="22"/>
         </w:rPr>
-        <w:t>Chronic postsurgical pain (CPSP) affects a large fraction of surgical patients but its biological basis is still poorly understood, especially along the nerve pathway that links the spinal cord with the dorsal root ganglion (DRG). We reanalysed 12 publicly available gene-expression datasets covering nerve-injury and surgical-incision pain models to build an integrated map of how the injured nerve environment reshapes gene activity across this DRG–spinal axis. Because four of the five axis studies are nerve-injury models and only one is a surgical-incision model, we frame the axis as a nerve-injury-associated transcriptional response rather than a CPSP-specific mechanism, and we treat the incision arm separately as a translation test. We identified a consistent programme (descriptive) dominated by immune activation and metabolic change, but we also uncovered important boundaries: the signature was highly sensitive to how the individual studies were combined, and it did not carry over to the surgical-incision setting. We then screened the entire catalogue of FDA-approved drugs against candidate targets and, using rigorous controls, found no drug target that held up reliably, a deliberately honest negative result, reported as a methodological boundary rather than a false lead. All analysis code and processed data are released publicly so that the findings can be fully reproduced. Rather than claiming a new drug, we provide a transparent, reusable benchmark that shows where current repurposing approaches in this field are fragile, helping future studies avoid over-interpretation.</w:t>
+        <w:t>Chronic postsurgical pain (CPSP) affects a large fraction of surgical patients but its biological basis is still poorly understood, especially along the nerve pathway that links the spinal cord with the dorsal root ganglion (DRG). We reanalysed 12 publicly available gene-expression datasets covering nerve-injury and surgical-incision pain models to build an integrated map of how the injured nerve environment reshapes gene activity across this DRG-centred nerve-injury axis with spinal-cord localisation. Because four of the five axis studies are nerve-injury models and only one is a surgical-incision model, we frame the axis as a nerve-injury-associated transcriptional response rather than a CPSP-specific mechanism, and we treat the incision arm separately as a translation test. We identified a consistent programme (descriptive) dominated by immune activation and metabolic change, but we also uncovered important boundaries: the signature was highly sensitive to how the individual studies were combined, and it did not carry over to the surgical-incision setting. We then screened the entire catalogue of FDA-approved drugs against candidate targets and, using rigorous controls, found no drug target that held up reliably, a deliberately honest negative result, reported as a methodological boundary rather than a false lead. All analysis code and processed data are released publicly so that the findings can be fully reproduced. Rather than claiming a new drug, we provide a transparent, reusable benchmark that shows where current repurposing approaches in this field are fragile, helping future studies avoid over-interpretation.</w:t>
       </w:r>
     </w:p>
     <w:p>
@@ -250,7 +250,7 @@
           <w:i w:val="0"/>
           <w:sz w:val="22"/>
         </w:rPr>
-        <w:t>Chronic postsurgical pain (CPSP) develops in 10–50% of surgical patients and persists beyond the normal healing window, imposing a substantial and under-served burden on quality of life and healthcare cost¹. Current pharmacotherapy, gabapentinoids, NSAIDs and opioids, was largely validated outside the surgical-incision context (opioid peptides and receptors act within the DRG and spinal cord during inflammatory and neuropathic states²), and none specifically targets the transition from acute postoperative pain to its chronic state. Because the peripheral injury signal must reach and re-shape the central pain matrix, mechanistic investigation of CPSP benefits from viewing the dorsal root ganglion (DRG) and spinal cord not as separate tissues but as a single peripheral–central axis.</w:t>
+        <w:t>Chronic postsurgical pain (CPSP) develops in 10–50% of surgical patients and persists beyond the normal healing window, imposing a substantial and under-served burden on quality of life and healthcare cost¹. Current pharmacotherapy, gabapentinoids, NSAIDs and opioids, was largely validated outside the surgical-incision context (opioid peptides and receptors act within the DRG and spinal cord during inflammatory and neuropathic states²), and none specifically targets the transition from acute postoperative pain to its chronic state. Because the peripheral injury signal must reach and re-shape the central pain matrix, mechanistic investigation of CPSP benefits from viewing the dorsal root ganglion (DRG) and spinal cord not as separate tissues but as a linked peripheral–central pathway.</w:t>
       </w:r>
     </w:p>
     <w:p>
@@ -264,7 +264,7 @@
           <w:i w:val="0"/>
           <w:sz w:val="22"/>
         </w:rPr>
-        <w:t>Two gaps limit the field. First, most transcriptomic studies of CPSP remain single-tissue and single-model: the closest CPSP work captures only the central spinal pole and lacks the DRG partner³, whereas DRG-centred studies cluster in nerve-injury or constriction models rather than surgical incision⁴,⁵. Recent resources now add a multi-tissue CPSP dataset that includes DRG⁶ and a spinal-cord neuropathic-pain atlas⁷, but an integrative DRG–spinal axis meta-analysis is still absent. Second, the virtual-screening repurposing literature frequently reports Tier-1 enrichment without a prospectively specified full-library breadth analysis, reverse positive controls, or molecular-weight confounder correction⁸,⁹, creating a double-dipping risk in which a target looks promising only because the screened subset was small and biased.</w:t>
+        <w:t>Two gaps limit the field. First, most transcriptomic studies of CPSP remain single-tissue and single-model: the closest CPSP work captures only the central spinal pole and lacks the DRG partner³, whereas DRG-centred studies cluster in nerve-injury or constriction models rather than surgical incision⁴,⁵. Recent resources now add a multi-tissue CPSP dataset that includes DRG⁶ and a spinal-cord neuropathic-pain atlas⁷, but an integrative DRG-centred, spinal-localised meta-analysis is still absent. Second, the virtual-screening repurposing literature frequently reports Tier-1 enrichment without a prospectively specified full-library breadth analysis, reverse positive controls, or molecular-weight confounder correction⁸,⁹, creating a double-dipping risk in which a target looks promising only because the screened subset was small and biased.</w:t>
       </w:r>
     </w:p>
     <w:p>
@@ -278,7 +278,7 @@
           <w:i w:val="0"/>
           <w:sz w:val="22"/>
         </w:rPr>
-        <w:t>Here we dissect the DRG–spinal axis computationally across 12 curated GEO datasets spanning incision, nerve-injury and spared-nerve-injury (SNI) models in rat, mouse and human. We (i) define a core axis signature by Stouffer meta-analysis with real-sample-size weighting, (ii) test pathway coordination with permutation-calibrated gene-set statistics corrected across sets, (iii) identify candidate hub genes by a leakage-controlled dual-machine-learning consensus (LASSO + Random Forest + XGBoost, leave-one-dataset-out), (iv) localise hubs in single-cell and spatial transcriptomes, and (v) run a prospectively specified, full-library structure-based repurposing of the FDA-approved catalogue with reverse positive controls. We report all results transparently, including an honestly negative human layer and an honestly negative full-library docking screen, and frame the work explicitly as hypothesis-generating rather than causal. We note at the outset that four of the five DRG-axis studies are nerve-injury models and that only one incision model is available, so the axis is framed as a nerve-injury-associated transcriptional response, not a CPSP-specific mechanism. To our knowledge, this is among the first CPSP-adjacent studies to integrate DRG and spinal-cord transcriptomes as a single axis via multi-dataset meta-analysis (recent single-tissue resources include a multi-tissue CPSP DRG dataset⁶ and a spinal-cord neuropathic-pain atlas⁷), and, to our knowledge, among the first to identify hubs by a dual-ML consensus under LODO leakage control and to report a prospectively specified full-library FDA repurposing screen that, despite reverse controls, yielded no reliable enrichment, turning an honest null into an explicit methodological boundary.</w:t>
+        <w:t>Here we dissect the DRG-centred nerve-injury axis with spinal-cord localisation across 12 curated GEO accessions spanning incision, nerve-injury and spared-nerve-injury (SNI) models in rat, mouse and human; of these, five transcriptomic studies (six contrasts) inform the Stouffer meta-analysis, and seven single-cell/spatial/miRNA datasets provide localisation and the human plasma layer. We (i) define a core axis signature by Stouffer meta-analysis with real-sample-size weighting, (ii) test pathway coordination with permutation-calibrated gene-set statistics corrected across sets, (iii) identify candidate hub genes by a leakage-controlled dual-machine-learning consensus (LASSO + Random Forest + XGBoost, leave-one-dataset-out), (iv) localise hubs in single-cell and spatial transcriptomes, and (v) run a prospectively specified, full-library structure-based repurposing of the FDA-approved catalogue with reverse positive controls. We report all results transparently, including an honestly negative human layer and an honestly negative full-library docking screen, and frame the work explicitly as hypothesis-generating rather than causal. We note at the outset that four of the five DRG-axis studies are nerve-injury models and that only one incision model is available, so the axis is framed as a nerve-injury-associated transcriptional response, not a CPSP-specific mechanism. To our knowledge, this is among the first CPSP-adjacent studies to integrate DRG and spinal-cord transcriptomes as a single axis via multi-dataset meta-analysis (recent single-tissue resources include a multi-tissue CPSP DRG dataset⁶ and a spinal-cord neuropathic-pain atlas⁷), and, to our knowledge, among the first to identify hubs by a dual-ML consensus under LODO leakage control and to report a prospectively specified full-library FDA repurposing screen that, despite reverse controls, yielded no reliable enrichment, turning an honest null into an explicit methodological boundary.</w:t>
       </w:r>
     </w:p>
     <w:p>
@@ -320,7 +320,7 @@
           <w:i w:val="0"/>
           <w:sz w:val="22"/>
         </w:rPr>
-        <w:t>The DRG-axis Stouffer meta-analysis (5 independent studies represented by 6 contrasts, because one spared-nerve-injury (SNI) study, GSE265957, contributes two ribosome-profiling timepoints, D4 acute and D63 chronic, as separate inputs; see the measurement-heterogeneity caveat below) tested 16,552 genes, yielding 6,869 at meta_FDR &lt; 0.05 and a core signature of 4,055 genes (meta_FDR &lt; 0.05 and direction consistency ≥ 0.8). Each contrast was weighted by its real per-group sample size, w = √(n_case·n_ctrl/(n_case+n_ctrl)); the four bulk-transcriptome contrasts carried weights 2.19 (GSE267799), 1.22 (GSE212311), 2.65 (GSE278227) and 1.49 (GSE241361 DRG), and the two translatome timepoints 1.00 each. The two GSE265957 timepoints are ribosome-profiling measurements from the same animals at D4 and D63 and are therefore not statistically independent; their joint contribution to the six-input meta is bounded by the bulk-only (translatome excluded) and collapse (timepoints merged) sensitivity analyses reported below. Because the two translatome timepoints each carry weight w = 1.00, they together contribute 2.00 to Σw² (2.00/17.52 ≈ 11.4% of total variance weight), comparable to — not twice — a single midsize bulk study (GSE241361_DRG w² = 2.22, 12.7%; GSE212311 w² = 1.50, 8.6%). The two timepoints are from the same animals and are not statistically independent; their joint influence is bounded by the bulk-only (overlap 54.3%) and collapse (retention 91.4%) sensitivity analyses. This weight is the standard inverse-variance weight for a standardised effect (Var(δ_i) ∝ 1/n_eff,i with n_eff = n_case·n_ctrl/(n_case+n_ctrl)); it is not an ad hoc or degenerate equal weighting, and the per-contrast Welch t statistics are treated as asymptotic z under the real per-group sample sizes. Because the two GSE265957 timepoints are from the same animals, treating them as two independent inputs makes the fixed-effect meta standard error marginally anti-conservative (the effective independent sample size is overstated by the 11.4% same-animal weight); the bulk-only (overlap 54.3%) and collapse (retention 91.4%) sensitivity analyses bound this over-statement, and all fixed-effect gene-level claims are conditioned on it. The Stouffer meta core is thus a DRG-axis product (all six inputs are DRG or DRG translatome); the spinal-cord dimension of this studied axis is supplied independently by the LODO spinal fold and the Visium spatial layer, not by the meta core. The signature was biologically validated by strong positive controls: ATF3 ranked first (meta_Z 10.53, FDR 1.0e-21, consistency 1.00), followed by GAL, ECEL1, NPY, FLRT3 and SOCS3, classic DRG injury/pain molecules.</w:t>
+        <w:t>The DRG-axis Stouffer meta-analysis (5 independent studies represented by 6 contrasts, because one spared-nerve-injury (SNI) study, GSE265957, contributes two ribosome-profiling timepoints, D4 acute and D63 chronic, as separate inputs; see the measurement-heterogeneity caveat below) tested 16,552 genes, yielding 6,869 at meta_FDR &lt; 0.05 and a core signature of 4,055 genes (meta_FDR &lt; 0.05 and direction consistency ≥ 0.8). Each contrast was weighted by its real per-group sample size, w = √(n_case·n_ctrl/(n_case+n_ctrl)); the four bulk-transcriptome contrasts carried weights 2.19 (GSE267799), 1.22 (GSE212311), 2.65 (GSE278227) and 1.49 (GSE241361 DRG), and the two translatome timepoints 1.00 each. The two GSE265957 timepoints are ribosome-profiling measurements from the same animals at D4 and D63 and are therefore not statistically independent; their joint contribution to the six-input meta is bounded by the bulk-only (translatome excluded) and collapse (timepoints merged) sensitivity analyses reported below. Because the two translatome timepoints each carry weight w = 1.00, they together contribute 2.00 to Σw² (2.00/17.52 ≈ 11.4% of total variance weight), comparable to — not twice — a single midsize bulk study (GSE241361_DRG w² = 2.22, 12.7%; GSE212311 w² = 1.50, 8.6%). The 11.4% is a share of total inverse-variance weight, not an 11% inflation of the result: de-duplicating the two same-animal timepoints changes Σw² from 17.52 to 16.52 (a 5.7% reduction) and lengthens the fixed-effect standard error by only ~3%, so the anti-conservatism from treating them as independent is modest and bounded. The two timepoints are from the same animals and are not statistically independent; their joint influence is bounded by the bulk-only (overlap 54.3%) and collapse (retention 91.4%) sensitivity analyses. This weight is the standard inverse-variance weight for a standardised effect (Var(δ_i) ∝ 1/n_eff,i with n_eff = n_case·n_ctrl/(n_case+n_ctrl)); it is not an ad hoc or degenerate equal weighting, and the per-contrast Welch t statistics are treated as asymptotic z under the real per-group sample sizes. Because the two GSE265957 timepoints are from the same animals, treating them as two independent inputs makes the fixed-effect meta standard error marginally anti-conservative (the effective independent sample size is overstated by the 11.4% same-animal weight); the bulk-only (overlap 54.3%) and collapse (retention 91.4%) sensitivity analyses bound this over-statement, and all fixed-effect gene-level claims are conditioned on it. The Stouffer meta core is thus a DRG-axis product (all six inputs are DRG or DRG translatome); the spinal-cord dimension of this studied axis is supplied independently by the LODO spinal fold and the Visium spatial layer, not by the meta core. The signature was biologically validated by strong positive controls: ATF3 ranked first (meta_Z 10.53, FDR 1.0e-21, consistency 1.00), followed by GAL, ECEL1, NPY, FLRT3 and SOCS3, classic DRG injury/pain molecules.</w:t>
       </w:r>
     </w:p>
     <w:p>
@@ -343,7 +343,7 @@
           <w:i w:val="0"/>
           <w:sz w:val="22"/>
         </w:rPr>
-        <w:t xml:space="preserve"> Because a fixed-effect combination assumes a single common effect across contrasts that differ in species, injury model and measurement platform, we repeated the meta-analysis under a DerSimonian–Laird random-effects model on the same per-contrast Z-values. Heterogeneity was moderate overall by Higgins–Thompson convention (median I² ≈39% across all genes) but substantial within the candidate-hub subset — median I² 72.8% across the 35 hubs, 18/35 retaining FDR_RE &lt; 0.05 — so fixed-effect gene-level claims are most conditional exactly where they matter most; non-negligible even at the whole-genome level: median τ² = 0.232 and median I² = 38.8%, with 41.9% of genes showing I² &gt; 50% and 68.1% showing τ² &gt; 0. Under random effects the core (FDR_RE &lt; 0.05 and consistency ≥ 0.8) shrank to 1,008 genes, 24.9% of the fixed-effect core. The fixed-effect core is therefore reported as the primary result and the random-effects core as its sensitivity bound; gene-level conclusions drawn from the 4,055-gene set should be read as conditional on moderate between-contrast heterogeneity. We report the FE core as primary because the FE combination is the conventional fixed-combination summary for real-sample-size weighting and because heterogeneity-sensitivity is itself the object of the RE/bulk-only/collapse suite; FE-conditional gene-level claims are flagged throughout. Among the 35 hubs, median I² was 72.8% and 18/35 retained FDR_RE &lt; 0.05.</w:t>
+        <w:t xml:space="preserve"> Because a fixed-effect combination assumes a single common effect across contrasts that differ in species, injury model and measurement platform, we repeated the meta-analysis under a DerSimonian–Laird random-effects model on the same per-contrast Z-values. Heterogeneity was moderate overall by Higgins–Thompson convention (median I² ≈39% across all genes) but substantial within the candidate-hub subset — median I² 72.8% across the 35 hubs, 18/35 retaining FDR_RE &lt; 0.05 — so fixed-effect gene-level claims are most conditional exactly where they matter most; non-negligible even at the whole-genome level: median τ² = 0.232 and median I² = 38.8%, with 41.9% of genes showing I² &gt; 50% and 68.1% showing τ² &gt; 0. Under random effects the core (FDR_RE &lt; 0.05 and consistency ≥ 0.8) shrank to 1,008 genes, 24.9% of the fixed-effect core. The fixed-effect core is therefore reported as the primary result (FE-conditional, heterogeneity-sensitive estimate) and the random-effects core as its sensitivity bound; gene-level conclusions drawn from the 4,055-gene set should be read as conditional on moderate between-contrast heterogeneity. We report the FE core as primary because the FE combination is the conventional fixed-combination summary for real-sample-size weighting and because heterogeneity-sensitivity is itself the object of the RE/bulk-only/collapse suite; FE-conditional gene-level claims are flagged throughout. Among the 35 hubs, median I² was 72.8% and 18/35 retained FDR_RE &lt; 0.05.</w:t>
       </w:r>
     </w:p>
     <w:p>
@@ -398,7 +398,7 @@
           <w:i w:val="0"/>
           <w:sz w:val="22"/>
         </w:rPr>
-        <w:t xml:space="preserve"> (Xtail log2FC) rather than a bulk transcriptome, mixed with bulk-transcriptome meta_Z from the other studies, we repeated the meta-analysis on the four bulk studies only. This bulk-only meta-analysis (four bulk studies) defined a core of 2,512 genes under the same union-K≥3 inclusion rule as the primary (a gene retained if present in ≥3 of the four bulk contrasts, with bulk meta_FDR &lt; 0.05 and consistency ≥ 0.8), of which 2,202 (54.3%) overlapped the primary 4,055-gene core. The 54.3% figure is the conservative, threshold-strict overlap: it is the primary core ∩ bulk-significant core, where the bulk core applies consistency ≥ 0.8. Within that 2,202 overlap, 1,707 genes are concordant across all four bulk contrasts (pure 4/4) and 495 are concordant in exactly 3 of 4 (K = 3); the overlap is therefore more precisely described as ≥3/4 concordance, not as strict 4/4. When the bulk consistency gate is relaxed from ≥0.8 to ≥3/4 — the largest achievable majority concordance for four contrasts, versus ≥5/6 ≈ 0.83 for six — the overlap rises to 3,587/4,055 = 88.5%, recovering 1,385 of the 1,853 genes that appear lost under the stricter gate. Of the 4,055 primary-core genes, 313 lack any bulk-study support: 211 are present in the four-bulk file but not bulk-significant (bulk meta_FDR ≥ 0.05) and 102 are absent from the four-bulk file entirely (never evaluated by the bulk analysis); the remaining 468 fall outside even the relaxed ≥3/4 overlap. The translatome-specific contribution to core membership is therefore bounded by 211 (present-but-non-significant) to 313 (including never-bulk-tested), and the apparent 45.7% "translatome-dependence" of gene-level membership is substantially a threshold/concordance-count artefact rather than a disappearance of the axis. (An earlier, more restrictive all-four-present count of 1,981 is superseded by this method-identical definition.) The neuroimmune programme nonetheless survived: neuroinflammation (mean_Z +5.13, 100% up, perm p ≤ 0.0005), DAM microglia (+3.96, 87.5% up, perm p ≤ 0.0005), complement (+3.54, 93.8% up, perm p ≤ 0.0005) and OXPHOS (−2.80, 72.2% of members down, perm p ≤ 0.0005, polarity-opposed). As in the primary meta, no ion-channel family was coordinately changed (Nav_SCN perm p = 0.268; P2RX/P2RY perm p = 0.339; TRP 0.917; CACNA 0.827). We therefore report the </w:t>
+        <w:t xml:space="preserve"> (Xtail log2FC) rather than a bulk transcriptome, mixed with bulk-transcriptome meta_Z from the other studies, we repeated the meta-analysis on the four bulk studies only. This bulk-only meta-analysis (four bulk studies) defined a core of 2,512 genes under the same union-K≥3 inclusion rule as the primary (a gene retained if present in ≥3 of the four bulk contrasts, with bulk meta_FDR &lt; 0.05 and consistency ≥ 0.8), of which 2,202 (54.3%) overlapped the primary 4,055-gene core. The 54.3% figure is the conservative, threshold-strict overlap: it is the primary core ∩ bulk-significant core, where the bulk core applies consistency ≥ 0.8. Within that 2,202 overlap, 1,707 genes are concordant across all four available bulk contrasts (pure 4/4). A further 495 were measured in only three of the four bulk datasets (the fourth absent for that gene, e.g. below detection or failing QC) and were concordant in those three (consistency = 1.0); the 'not strict 4/4' component therefore reflects reduced measurement coverage (lower K), not directional disagreement among four available contrasts. The overlap is thus better described as ≥3/4 concordance under availability, not as strict 4/4. When the bulk consistency gate is relaxed from ≥0.8 to ≥3/4 — the largest achievable majority concordance for four contrasts, versus ≥5/6 ≈ 0.83 for six — the overlap rises to 3,587/4,055 = 88.5%, recovering 1,385 of the 1,853 genes that appear lost under the stricter gate. Of the 4,055 primary-core genes, 313 lack any bulk-study support: 211 are present in the four-bulk file but not bulk-significant (bulk meta_FDR ≥ 0.05) and 102 are absent from the four-bulk file entirely (never evaluated by the bulk analysis). A total of 468 genes fall outside even the relaxed ≥3/4 overlap, comprising the 313 just described plus a further 155 bulk-significant genes that fall below the 3/4 consistency gate. The translatome-specific contribution to core membership is therefore bounded by 211 (present-but-non-significant) to 313 (including never-bulk-tested), and the apparent 45.7% "translatome-dependence" of gene-level membership is substantially a threshold/concordance-count artefact rather than a disappearance of the axis. (An earlier, more restrictive all-four-present count of 1,981 is superseded by this method-identical definition.) The neuroimmune programme nonetheless survived: neuroinflammation (mean_Z +5.13, 100% up, perm p ≤ 0.0005), DAM microglia (+3.96, 87.5% up, perm p ≤ 0.0005), complement (+3.54, 93.8% up, perm p ≤ 0.0005) and OXPHOS (−2.80, 72.2% of members down, perm p ≤ 0.0005, polarity-opposed). As in the primary meta, no ion-channel family was coordinately changed (Nav_SCN perm p = 0.268; P2RX/P2RY perm p = 0.339; TRP 0.917; CACNA 0.827). We therefore report the </w:t>
       </w:r>
       <w:r>
         <w:rPr>
@@ -667,7 +667,7 @@
           <w:i w:val="0"/>
           <w:sz w:val="22"/>
         </w:rPr>
-        <w:t xml:space="preserve">Honest evaluation identified a candidate nerve-injury-enriched — not universally generalisable — LODO signal (Fig. 2A), with explicit precision caveats (below). Under leakage-controlled leave-one-dataset-out, four of the five folds reached AUC 1.000 (GSE278227 CCI rat DRG, n = 28; GSE212311 CCI, n = 6; and the two same-animal GSE241361 folds — mouse DRG AUC 1.000, n = 9; spinal cord AUC 1.000, n = 9 — which are excluded from the cross-animal mean); the two genuinely independent cross-animal nerve-injury folds are GSE278227 (n = 28) and GSE212311 (n = 6), both at AUC 1.000, and the candidate nerve-injury-enriched — not universal — conclusion rests on this pattern rather than on a quoted cross-animal mean. GSE212311 is a 3-versus-3 design (n = 6); under complete class separation its exact two-sided Mann–Whitney p is 0.10 (one-sided 0.05), the minimum attainable for that sample size, so its AUC 1.0 is the statistical floor of the design rather than independent evidence, and the cross-animal nerve-injury-enriched conclusion rests principally on GSE278227 (n = 28). The signature does not generalise to the incision model: the pivotal incision fold (GSE267799 n = 20) falls to a leakage-controlled 0.677 [0.374, 0.940], a confidence interval that includes chance, so it neither confirms nor refutes incision generalisation; the candidate nerve-injury-enriched framing of the axis therefore rests on the nerve-injury folds rather than on a demonstrated failure of incision generalisation. Leave-one-dataset-out (LODO) cross-validation was the primary generalisation metric. For the cross-animal held-out datasets the raw (non-leakage) classifier AUC was 1.000 for GSE278227 (n = 28) and GSE212311 (n = 6), and 0.917 [0.729, 1.000] for GSE267799 (n = 20, the incision arm); the two GSE241361 tests (mouse DRG AUC 1.000, n = 9; spinal cord AUC 0.950 [0.709, 1.000], n = 9, raw non-leakage; the leakage-controlled value is 1.000) come from the same animals and are excluded from the cross-animal mean. A leakage-controlled re-estimation (feature selection recomputed out-of-fold; </w:t>
+        <w:t xml:space="preserve">Honest evaluation identified a candidate nerve-injury-enriched — not universally generalisable — LODO signal (Fig. 2A), with explicit precision caveats (below). Under leakage-controlled leave-one-dataset-out, four of the five folds reached AUC 1.000 (GSE278227 CCI rat DRG, n = 28; GSE212311 CCI, n = 6; and the two same-animal GSE241361 folds — mouse DRG AUC 1.000, n = 9; spinal cord AUC 1.000, n = 9 — which are excluded from the cross-animal mean); the two genuinely independent cross-animal nerve-injury folds are GSE278227 (n = 28) and GSE212311 (n = 6), both at AUC 1.000, and the candidate nerve-injury-enriched — not universal — conclusion rests on this pattern rather than on a quoted cross-animal mean. Every AUC = 1.000 quote carries a degenerate DeLong confidence interval [1.0, 1.0] (zero estimable precision) because the test sets are small (n = 6–28) and the classifiers select 139–164 features from ~44 training samples (events-per-parameter ≈ 0.15); the nerve-injury-enriched signal is therefore reported as exploratory, hypothesis-generating evidence from a single n = 28 fold (GSE278227), not as a precision estimate. GSE212311 is a 3-versus-3 design (n = 6); under complete class separation its exact two-sided Mann–Whitney p is 0.10 (one-sided 0.05), the minimum attainable for that sample size, so its AUC 1.0 is the statistical floor of the design rather than independent evidence, and the cross-animal nerve-injury-enriched conclusion rests principally on GSE278227 (n = 28). The signature does not generalise to the incision model: the pivotal incision fold (GSE267799 n = 20) falls to a leakage-controlled 0.677 [0.374, 0.940], a confidence interval that includes chance, so it neither confirms nor refutes incision generalisation; the candidate nerve-injury-enriched framing of the axis therefore rests on the nerve-injury folds rather than on a demonstrated failure of incision generalisation. Leave-one-dataset-out (LODO) cross-validation was the primary generalisation metric. For the cross-animal held-out datasets the raw (non-leakage) classifier AUC was 1.000 for GSE278227 (n = 28) and GSE212311 (n = 6), and 0.917 [0.729, 1.000] for GSE267799 (n = 20, the incision arm); the two GSE241361 tests (mouse DRG AUC 1.000, n = 9; spinal cord AUC 0.950 [0.709, 1.000], n = 9, raw non-leakage; the leakage-controlled value is 1.000) come from the same animals and are excluded from the cross-animal mean. A leakage-controlled re-estimation (feature selection recomputed out-of-fold; </w:t>
       </w:r>
       <w:r>
         <w:rPr>
@@ -777,7 +777,7 @@
           <w:i w:val="0"/>
           <w:sz w:val="24"/>
         </w:rPr>
-        <w:t>Hubs are a multi-cellular DRG–spinal programme</w:t>
+        <w:t>Hubs are a multi-cellular DRG-centred, spinal-localised programme</w:t>
       </w:r>
     </w:p>
     <w:p>
@@ -939,7 +939,7 @@
           <w:i w:val="0"/>
           <w:sz w:val="22"/>
         </w:rPr>
-        <w:t xml:space="preserve"> controls (the screen can in principle separate known binders) but, as shown below, none survives the stricter size-independent enrichment test. At the single-variable level, after molecular-weight correction the size-independent increment (ΔAUC versus the MW-only baseline) had a 95% confidence interval that contained zero for both AXL [−0.030, +0.104] and TNIK [−0.224, +0.193], and ACVR1 and MAPK14 matched the MW-only baseline. A stricter multivariate physicochemical control (logistic known-binder ~ MW + logP + TPSA + HBD + HBA + rotB + docking affinity) showed that docking affinity added statistically significant discrimination beyond chemotype for AXL (likelihood-ratio p = 2.6e-5; AUC 0.895 → 0.927) and TNIK (p = 7.3e-5; 0.852 → 0.898); for ACVR1 the same model gave an apparently significant likelihood-ratio test (p = 9.6e-4; AUC 0.898 → 0.931), but this is not supported by the multivariate Wald test on the affinity coefficient (p = 0.17) nor by the simpler single-variable size-independent ΔAUC test (p = 0.584), and it rests on only 9 positive events against ~7 parameters (EPV ≈ 1), so we treat it as a non-reproducible fluctuation rather than signal; MAPK14 was marginal (p = 0.066) and ADRA2A only weak (p = 0.027; AUC 0.791 → 0.797). The same asymmetry standard applied to ACVR1 also applies to ADRA2A: its multivariate likelihood-ratio test is significant (p = 0.027) but the multivariate Wald test on the docking-affinity coefficient is not (p = 0.504), and the full-library AUC is non-informative (0.532, p = 0.118), so ADRA2A's apparent signal is likewise a non-reproducible fluctuation rather than established docking evidence; we hold it to the identical standard. Events-per-parameter (EPV) were low throughout: ACVR1 1.1, AXL 1.6, TNIK 1.3, MAPK14 2.0, ADRA2A ≈14; all ChEMBL-annotated positive controls except ADRA2A fall at EPV ≤ 2, far below the conventional ≥10, so the "discrimination beyond chemotype" for AXL, TNIK and ACVR1 is itself tentative and the multivariate likelihood-ratio test is a method-capability demonstration, not target evidence. The screen therefore cannot claim a validated enrichment for any candidate target, and the honest null applies to the absence of a reliable, size-independent candidate hit rather than to a broken method.</w:t>
+        <w:t xml:space="preserve"> controls (the screen can in principle separate known binders) but, as shown below, none survives the stricter size-independent enrichment test. At the single-variable level, after molecular-weight correction the size-independent increment (ΔAUC versus the MW-only baseline) had a 95% confidence interval that contained zero for both AXL [−0.030, +0.104] and TNIK [−0.224, +0.193], and ACVR1 and MAPK14 matched the MW-only baseline. A stricter multivariate physicochemical control (logistic known-binder ~ MW + logP + TPSA + HBD + HBA + rotB + docking affinity) showed that docking affinity added statistically significant discrimination beyond chemotype for AXL (likelihood-ratio p = 2.6e-5; AUC 0.895 → 0.927; EPV ≈ 1.9) and TNIK (p = 7.3e-5; 0.852 → 0.898; EPV ≈ 1.4); both rest on only ~9 positive events against ~7–9 parameters (EPV ≈ 1–2, far below the conventional ≥10), so the apparent discrimination is descriptive and EPV-unstable rather than validation, and is inconsistent with the simpler single-variable size-independent ΔAUC test (AXL [−0.030, +0.104], TNIK [−0.224, +0.193], neither exceeding zero); for ACVR1 the same model gave an apparently significant likelihood-ratio test (p = 9.6e-4; AUC 0.898 → 0.931), but this is not supported by the multivariate Wald test on the affinity coefficient (p = 0.17) nor by the simpler single-variable size-independent ΔAUC test (p = 0.584), and it rests on only 9 positive events against ~7 parameters (EPV ≈ 1), so we treat it as a non-reproducible fluctuation rather than signal; MAPK14 was marginal (p = 0.066) and ADRA2A only weak (p = 0.027; AUC 0.791 → 0.797). The same asymmetry standard applied to ACVR1 also applies to ADRA2A: its multivariate likelihood-ratio test is significant (p = 0.027) but the multivariate Wald test on the docking-affinity coefficient is not (p = 0.504), and the full-library AUC is non-informative (0.532, p = 0.118), so ADRA2A's apparent signal is likewise a non-reproducible fluctuation rather than established docking evidence; we hold it to the identical standard. Events-per-parameter (EPV) were low throughout: ACVR1 1.1, AXL 1.6, TNIK 1.3, MAPK14 2.0, ADRA2A ≈14; all ChEMBL-annotated positive controls except ADRA2A fall at EPV ≤ 2, far below the conventional ≥10, so the "discrimination beyond chemotype" for AXL, TNIK and ACVR1 is itself tentative and the multivariate likelihood-ratio test is a method-capability demonstration, not target evidence. The screen therefore cannot claim a validated enrichment for any candidate target, and the honest null applies to the absence of a reliable, size-independent candidate hit rather than to a broken method.</w:t>
       </w:r>
     </w:p>
     <w:p>
@@ -2910,7 +2910,7 @@
           <w:i w:val="0"/>
           <w:sz w:val="22"/>
         </w:rPr>
-        <w:t>The DRG–spinal axis is recurrently characterized by a neuroimmune–metabolic programme that is best described as a nerve-injury-associated transcriptional response rather than a CPSP-specific pathway on the available evidence (this inference rests on a single, heterogeneous incision arm and is provisional): coordinated DAM-like neuroimmune and complement activation²¹,²⁴,²⁵ (the DAM programme was first defined in neurodegeneration by Keren-Shaul et al.²⁶ and is increasingly implicated in pain-state microglial reprogramming, though only partially and in a time- and sex-dependent manner²¹; our DAM-like set follows that neurodegeneration-defined provenance — distinct from the developmental/homeostatic microglia described by Schafer et al.²⁷ — and is therefore described as DAM-like). To quantify the 'DAM-like' qualifier, we checked the canonical DAM hallmark genes against the Stouffer up-regulated meta core (K = 5–6 DRG datasets per gene, by availability): TYROBP (meta FDR 8.8 × 10⁻⁹; consistency 5/5 datasets) and TREM2 (meta FDR 1.3 × 10⁻³; consistency 5/6) are both within the FDR &lt; 0.05 core, whereas APOE, although directionally consistent (consistency 6/6, up-regulated), does not reach the FDR &lt; 0.05 threshold (meta FDR 0.070); the partial, time- and sex-dependent recruitment of the DAM programme is therefore a data-supported, not merely metaphorical, descriptor. In the fixed-effect analysis only, OXPHOS suppression (which did not survive random-effects correction, q = 0.31), consistent with the growing literature on microglial–complement and energy-metabolism dysfunction in chronic and neuropathic pain²⁴,²⁵,²⁸,²⁹,³⁰,³¹, and with prior multi-tissue CPSP resources including a DRG-containing dataset⁶ and a spinal-cord neuropathic-pain atlas⁷. Chemokine signalling at the spinal dorsal horn, in particular the CXCL12/SDF-1 axis, has also been implicated in nerve-injury and postsurgical pain models³²,³³, reinforcing the neuroimmune component of the axis. The nerve-injury signature does not predict incision direction (46.2% versus a 47.1% background; difference −0.9 pp, p = 0.14), so specificity of the axis to postsurgical versus nerve-injury pain is not shown by this meta-analysis. This is not a pure ion-channel-null story: although broad ion-channel families did not change coordinately (Nav_SCN q = 0.44), the specific nociceptor sodium channels SCN9A, SCN10A, SCN11A and SCN8A were individually significant and down-regulated in nerve-injury models (SCN8A most significant, meta_Z −4.92, FDR 1.0e-5) but inverted to up-regulation in the single incision model, so we explicitly hedge any claim that Nav-channel down-regulation is a CPSP feature, and we bound this inversion as one-study, one-species evidence supported by a single incision arm. Because the channels we find down-regulated are the same ones targeted by conventional Nav-blocking strategies whose clinical efficacy has been limited¹⁶, the observation is a hypothesis about model-dependent transcriptional direction, not a therapeutic recommendation.</w:t>
+        <w:t>The DRG-centred nerve-injury axis (with spinal-cord localisation) is recurrently characterized by a neuroimmune programme with a fixed-effect-only, random-effects-fragile metabolic (OXPHOS-down) limb (q = 0.31 under RE) that is best described as a nerve-injury-associated transcriptional response rather than a CPSP-specific pathway on the available evidence (this inference rests on a single, heterogeneous incision arm and is provisional): coordinated DAM-like (myeloid: resident microglia and/or infiltrating macrophages) neuroimmune and complement activation²¹,²⁴,²⁵,²⁶ (the DAM programme was first defined in neurodegeneration by Keren-Shaul et al.²⁷ and is increasingly implicated in pain-state microglial reprogramming, though only partially and in a time- and sex-dependent manner²¹; our DAM-like set follows that neurodegeneration-defined provenance — distinct from the developmental/homeostatic microglia described by Schafer et al.²⁸ — and is therefore described as DAM-like). To quantify the 'DAM-like' qualifier, we checked the canonical DAM hallmark genes against the Stouffer up-regulated meta core (K = 5–6 DRG datasets per gene, by availability): TYROBP (meta FDR 8.8 × 10⁻⁹; consistency 5/5 datasets) and TREM2 (meta FDR 1.3 × 10⁻³; consistency 5/6) are both within the FDR &lt; 0.05 core, whereas APOE, although directionally consistent (consistency 6/6, up-regulated), does not reach the FDR &lt; 0.05 threshold (meta FDR 0.070); the partial, time- and sex-dependent recruitment of the DAM programme is therefore a data-supported, not merely metaphorical, descriptor. In the fixed-effect analysis only, OXPHOS suppression (which did not survive random-effects correction, q = 0.31), consistent with the growing literature on microglial–complement and energy-metabolism dysfunction in chronic and neuropathic pain²⁴,²⁵,²⁹,³⁰,³¹,³², and with prior multi-tissue CPSP resources including a DRG-containing dataset⁶ and a spinal-cord neuropathic-pain atlas⁷. Chemokine signalling at the spinal dorsal horn, in particular the CXCL12/SDF-1 axis, has also been implicated in nerve-injury and postsurgical pain models³³,³⁴, reinforcing the neuroimmune component of the axis. The nerve-injury signature does not predict incision direction (46.2% versus a 47.1% background; difference −0.9 pp, p = 0.14), so specificity of the axis to postsurgical versus nerve-injury pain is not shown by this meta-analysis. This is not a pure ion-channel-null story: although broad ion-channel families did not change coordinately (Nav_SCN q = 0.44), the specific nociceptor sodium channels SCN9A, SCN10A, SCN11A and SCN8A were individually significant and down-regulated in nerve-injury models (SCN8A most significant, meta_Z −4.92, FDR 1.0e-5) but inverted to up-regulation in the single incision model, so we explicitly hedge any claim that Nav-channel down-regulation is a CPSP feature, and we bound this inversion as one-study, one-species evidence supported by a single incision arm. Because the channels we find down-regulated are the same ones targeted by conventional Nav-blocking strategies whose clinical efficacy has been limited¹⁶, the observation is a hypothesis about model-dependent transcriptional direction, not a therapeutic recommendation.</w:t>
       </w:r>
     </w:p>
     <w:p>
@@ -2924,7 +2924,7 @@
           <w:i w:val="0"/>
           <w:sz w:val="22"/>
         </w:rPr>
-        <w:t>The dual-ML candidate hub set (35 genes; 91% overlapping the meta core) is not a list of "new" genes, ATF3, SPRR1A, NPY, VIP and others are well-established DRG injury markers⁴,⁵,³⁴. Our contribution is the convergence and prioritisation across independent computational routes under leakage control, and the multi-cellular/spatial localisation showing the programme spans DRG injured neurons and spinal neuron/microglia/astrocyte/OPC compartments, with 17 of 33 detectably expressed hubs anatomically present in the dorsal horn at baseline. We flag REG3B as a strong meta-significant but consistency-failing candidate, carried as an external motivational hypothesis (model-mismatched evidence¹⁹) rather than as a core internal hub, and the purinergic self-negative (P2RX/P2RY perm p = 0.339) as a boundary on the DAM interpretation.</w:t>
+        <w:t>The dual-ML candidate hub set (35 genes; 91% overlapping the meta core) is not a list of "new" genes, ATF3, SPRR1A, NPY, VIP and others are well-established DRG injury markers⁴,⁵,³⁵. Our contribution is the convergence and prioritisation across independent computational routes under leakage control, and the multi-cellular/spatial localisation showing the programme spans DRG injured neurons and spinal neuron/microglia/astrocyte/OPC compartments, with 17 of 33 detectably expressed hubs anatomically present in the dorsal horn at baseline. We flag REG3B as a strong meta-significant but consistency-failing candidate, carried as an external motivational hypothesis (model-mismatched evidence¹⁹) rather than as a core internal hub, and the purinergic self-negative (P2RX/P2RY perm p = 0.339) as a boundary on the DAM interpretation.</w:t>
       </w:r>
     </w:p>
     <w:p>
@@ -2938,7 +2938,7 @@
           <w:i w:val="0"/>
           <w:sz w:val="22"/>
         </w:rPr>
-        <w:t xml:space="preserve">The honest docking null is itself a methodological contribution. Most virtual-screening repurposing reports stop at Tier-1 enrichment⁸,⁹; we added prospectively specified full-library breadth, reverse positive controls, and MW correction, and showed that (a) ADRA2A's Tier-1 enrichment is non-informative (full-library AUC 0.532, NS; a weak MW-adjusted signal of 0.578, ΔAUC p ≈ 0.0005, is inconclusive), (b) known analgesics are not enriched, and (c) no candidate target cleared both filters we applied, the raw/full-library MW-corrected enrichment p and the size-independent (MW-adjusted) p, and the positive controls (AXL, TNIK, ACVR1, MAPK14) retain docking signal beyond chemotype only in a post-hoc multivariate control (Supplementary Table S4), yet none reaches a reliable candidate hit against the full-library baseline. This corrects the "repurposing panacea" narrative³⁵,³⁶ and shows how double-dipping produces false positives. The honest null is scoped explicitly to </w:t>
+        <w:t xml:space="preserve">The honest docking null is itself a methodological contribution. Most virtual-screening repurposing reports stop at Tier-1 enrichment⁸,⁹; we added prospectively specified full-library breadth, reverse positive controls, and MW correction, and showed that (a) ADRA2A's Tier-1 enrichment is non-informative (full-library AUC 0.532, NS; a weak MW-adjusted signal of 0.578, ΔAUC p ≈ 0.0005, is inconclusive), (b) known analgesics are not enriched, and (c) no candidate target cleared both filters we applied, the raw/full-library MW-corrected enrichment p and the size-independent (MW-adjusted) p, and the positive controls (AXL, TNIK, ACVR1, MAPK14) retain docking signal beyond chemotype only in a post-hoc multivariate control (Supplementary Table S4), yet none reaches a reliable candidate hit against the full-library baseline. This corrects the "repurposing panacea" narrative³⁶,³⁷ and shows how double-dipping produces false positives. The honest null is scoped explicitly to </w:t>
       </w:r>
       <w:r>
         <w:rPr>
@@ -2956,7 +2956,7 @@
           <w:i w:val="0"/>
           <w:sz w:val="22"/>
         </w:rPr>
-        <w:t>; the entire ion-channel analgesic class — α2δ subunits and NaV channels, including the clinically validated gabapentinoid and NaV1.7/NaV1.8 targets and the ion-channel members of the authors' own CPSP-literature set — was structurally undockable (no ligand-anchored pocket for a defined docking box) and was therefore never screened, so the null deliberately cannot speak to those mechanisms. The separate knowledge-informed Top-20 is a prospectively testable candidate set, not docking evidence, and is framed accordingly.</w:t>
+        <w:t>; the entire ion-channel analgesic class — α2δ subunits and NaV channels, including the clinically validated gabapentinoid (α2δ-1, the gabapentinoid binding site upregulated in injured DRG³⁸) and NaV1.7/NaV1.8 targets and the ion-channel members of the authors' own CPSP-literature set — was structurally undockable (no ligand-anchored pocket for a defined docking box) and was therefore never screened, so the null deliberately cannot speak to those mechanisms. The separate knowledge-informed Top-20 is a prospectively testable candidate set, not docking evidence, and is framed accordingly.</w:t>
       </w:r>
     </w:p>
     <w:p>
@@ -2979,7 +2979,7 @@
           <w:i w:val="0"/>
           <w:sz w:val="22"/>
         </w:rPr>
-        <w:t xml:space="preserve"> MAPK14, AXL and TFE3 have the strongest prior biological rationale among the tractable targets, but on our own pre-specified criteria none of them can be advanced: AXL and MAPK14 both failed the size-independent enrichment test (p = 0.141 and 0.579 respectively), and TFE3 was never docked. Naming them as "priorities" would contradict the honest null this paper is built on; they are recorded as hypotheses for which the present screen provides no positive docking evidence, and any ranking among the ten targets is also unstable because only 4 of 10 retain random-effects significance. Likewise, ADRA2A is neither prioritised nor excluded: it retains established α2A analgesic pharmacology and remains a plausible hypothesis, but its docking result is inconclusive (full-library AUC 0.532, NS; MW-adjusted 0.578), and its composite-ranking metrics are knowledge-informed retrieval, not docking evidence.</w:t>
+        <w:t xml:space="preserve"> Among the tractable targets, MAPK14, AXL and TFE3 carry the most frequently cited prior biological rationale, but this is descriptive weighting, not a validated priority: on our own pre-specified criteria none of them can be advanced — AXL and MAPK14 both failed the size-independent enrichment test (p = 0.141 and 0.579 respectively), and TFE3 was never docked. Naming them as "priorities" would contradict the honest null this paper is built on; they are recorded as hypotheses for which the present screen provides no positive docking evidence, and any ranking among the ten targets is also unstable because only 4 of 10 retain random-effects significance. Likewise, ADRA2A is neither prioritised nor excluded: it retains established α2A analgesic pharmacology and remains a plausible hypothesis, but its docking result is inconclusive (full-library AUC 0.532, NS; MW-adjusted 0.578), and its composite-ranking metrics are knowledge-informed retrieval, not docking evidence.</w:t>
       </w:r>
     </w:p>
     <w:p>
@@ -2993,7 +2993,7 @@
           <w:i w:val="0"/>
           <w:sz w:val="22"/>
         </w:rPr>
-        <w:t>Translational implication: the Top-20 docking candidate set is hypothesis-generating and requires wet-lab validation; no single drug is advocated. Prospective clinical validation of the 35 hubs is the defined next step, but it must be scoped correctly: neuron/glia-restricted hubs (e.g., SPRR1A, SRRM4, ECEL1) are not measurable in peripheral blood and require CSF or tissue; only hubs measurable as peripheral-blood PBMC mRNA or as soluble/secreted factors (NPY and VIP neuropeptides, SERPINE1/PAI-1) are suitable for the planned plasma qPCR/ELISA work; nuclear transcription factors (e.g., TFE3) and microglial markers (e.g., AXL) are weak blood proxies at best. Cerebrospinal fluid (CSF) and, where surgically available, human DRG or post-amputation neuromas are the mechanistically congruent biospecimens for neuron/glia-restricted hubs, and plasma remains a low-yield proxy — a caution already sounded by the honestly negative human plasma miRNA layer (p = 0.51). Direct DRG or spinal-cord biopsy is not clinically obtainable in CPSP patients, so the accessible human biospecimens are peripheral-blood PBMC, cerebrospinal fluid (CSF), and, where surgically available, post-amputation neuromas or scar-tissue nerve endings; the 35 hubs constitute a rodent axis signature that must be confirmed in human tissue before any therapeutic claim. A limitation shared with all computational CPSP work is the absence of direct human validation; our honestly negative human miRNA layer is a blood-based, underpowered null that demarcates where prospective confirmation is required rather than overstating the animal-to-human inference. We addressed residual physicochemical confounding with a multivariate control (logistic binder ~ MW + logP + TPSA + HBD + HBA + rotatable bonds + docking affinity; Supplementary Table S4): the strongest positive controls (AXL, TNIK, ACVR1) retain docking discrimination beyond chemotype, whereas ADRA2A remains weak and non-informative; this multivariate discrimination is itself tentative (events-per-parameter ≤ 2 for AXL, TNIK and ACVR1, far below the conventional ≥10), so it is a method-capability demonstration rather than evidence for any of these targets, and the honest-null conclusion is unchanged.</w:t>
+        <w:t>Translational implication: the Top-20 docking candidate set is hypothesis-generating and requires wet-lab validation; no single drug is advocated. Prospective clinical validation of the 35 hubs is the defined next step, but it must be scoped correctly: neuron/glia-restricted hubs (e.g., SPRR1A, SRRM4, ECEL1) are not measurable in peripheral blood and require CSF or tissue; only hubs measurable as peripheral-blood PBMC mRNA or as soluble/secreted factors (NPY and VIP neuropeptides, SERPINE1/PAI-1) are suitable for the planned plasma qPCR/ELISA work; nuclear transcription factors (e.g., TFE3) and microglial markers (e.g., AXL) are weak blood proxies at best. Cerebrospinal fluid (CSF) and, where surgically available, human DRG or post-amputation neuromas are the mechanistically congruent biospecimens for neuron/glia-restricted hubs, and plasma remains a low-yield proxy — a caution already sounded by the honestly negative human plasma miRNA layer (p = 0.51). Direct DRG or spinal-cord biopsy is not clinically obtainable in CPSP patients, so the accessible human biospecimens are peripheral-blood PBMC, cerebrospinal fluid (CSF), and, where surgically available, post-amputation neuromas or scar-tissue nerve endings; the 35 hubs constitute a rodent axis signature that must be confirmed in human tissue before any therapeutic claim. A limitation shared with all computational CPSP work is the absence of direct human validation; our honestly negative human miRNA layer is a blood-based, underpowered null that demarcates where prospective confirmation is required rather than overstating the animal-to-human inference. We addressed residual physicochemical confounding with a multivariate control (logistic binder ~ MW + logP + TPSA + HBD + HBA + rotatable bonds + docking affinity; Supplementary Table S4): the strongest positive controls (AXL, TNIK, ACVR1) retain docking discrimination beyond chemotype, whereas ADRA2A remains weak and non-informative; this multivariate discrimination is itself tentative (events-per-parameter ≤ 2 for all five ChEMBL-annotated positive controls — AXL, TNIK, ACVR1, MAPK14, ADRA2A — each ≈1–2, far below the conventional ≥10), so it is a method-capability demonstration rather than evidence for any of these targets, and the honest-null conclusion is unchanged.</w:t>
       </w:r>
     </w:p>
     <w:p>
@@ -3007,7 +3007,7 @@
           <w:i w:val="0"/>
           <w:sz w:val="24"/>
         </w:rPr>
-        <w:t>Conclusions</w:t>
+        <w:t>Limitations</w:t>
       </w:r>
     </w:p>
     <w:p>
@@ -3021,7 +3021,7 @@
           <w:i w:val="0"/>
           <w:sz w:val="22"/>
         </w:rPr>
-        <w:t>In this multi-dataset in-silico reanalysis, the DRG–spinal axis is a nerve-injury-associated, heterogeneity-sensitive transcriptional response rather than a CPSP-specific pathway on the available evidence (this conclusion rests on a single, heterogeneous incision arm and is provisional): its gene-set membership is highly sensitive to how the individual studies are combined (an honest random-effects sensitivity analysis shrinks the core from 4,055 to 1,008 genes, median I² = 38.8%), and the nerve-injury signature does not predict the single surgical-incision arm (46.2% vs 47.1% background, p = 0.14). A prospectively specified, full-library docking screen of the FDA-approved catalogue found no target that cleared both the full-library and size-independent enrichment filters (ADRA2A Tier-1 AUC 0.618 collapses to 0.532, p = 0.118; events-per-parameter ≤ 2 for all ChEMBL-annotated positive controls), so the honest docking null is a methodological boundary, not a false lead. We report these results transparently as hypothesis-generating and explicitly frame the work as preliminary foundation for a pending grant rather than as a causal or clinical claim.</w:t>
+        <w:t>The honest docking null is silent, not negative, on the validated non-opioid analgesic classes. The entire ion-channel analgesic class — α2δ subunits (gabapentinoid targets) and NaV channels (including the clinically validated NaV1.7/NaV1.8) — was structurally undockable (no ligand-anchored pocket for a defined docking box) and was therefore never screened, so the null deliberately cannot speak to those mechanisms; absence of docking enrichment is not evidence against gabapentinoid or NaV-channel action³⁸. Beyond this, the work is a secondary reanalysis of public data: it carries no new wet-lab measurements, the human layer is a blood-proxy (n = 60, underpowered), no dataset captures established chronic postsurgical pain (&gt;3 months; the incision arm models acute-to-subacute pain), DRG-resident macrophages are a recognised neuroimmune sentinel after nerve injury²⁶ yet the present bulk-tissue signal cannot resolve microglia from infiltrating macrophages, and the 35 hubs are a resampling-sensitive candidate set requiring prospective validation.</w:t>
       </w:r>
     </w:p>
     <w:p>
@@ -3035,7 +3035,21 @@
           <w:i w:val="0"/>
           <w:sz w:val="24"/>
         </w:rPr>
-        <w:t>Methods</w:t>
+        <w:t>Conclusions</w:t>
+      </w:r>
+    </w:p>
+    <w:p>
+      <w:pPr>
+        <w:spacing w:before="0" w:after="40"/>
+      </w:pPr>
+      <w:r>
+        <w:rPr>
+          <w:rFonts w:ascii="Times New Roman" w:hAnsi="Times New Roman"/>
+          <w:b w:val="0"/>
+          <w:i w:val="0"/>
+          <w:sz w:val="22"/>
+        </w:rPr>
+        <w:t>In this multi-dataset in-silico reanalysis, the DRG-centred nerve-injury axis (with spinal-cord localisation) is a nerve-injury-associated, heterogeneity-sensitive transcriptional response; on the available evidence it is not established as CPSP-specific — the translation test to the sole surgical-incision arm was non-significant (46.2% vs 47.1% background, p = 0.14) and underpowered, and the inference is provisional and does not demonstrate either CPSP-specificity or its absence. Its gene-set membership is highly sensitive to how the individual studies are combined (an honest random-effects sensitivity analysis shrinks the core from 4,055 to 1,008 genes, median I² = 38.8%), and the nerve-injury signature does not predict the single surgical-incision arm (46.2% vs 47.1% background, p = 0.14). A prospectively specified, full-library docking screen of the FDA-approved catalogue found no target that cleared both the full-library and size-independent enrichment filters (ADRA2A full-library AUC 0.532, p = 0.118 NS; Tier-1 subset AUC 0.618 — the breadth flip is the point; events-per-parameter ≤ 2 for all ChEMBL-annotated positive controls), so the honest docking null is a methodological boundary, not a false lead. No analysed dataset captures established chronic postsurgical pain (&gt;3 months); the incision arm models acute-to-subacute postoperative pain as a translational proxy, so the CPSP-specificity question is necessarily provisional. We report these results transparently as hypothesis-generating and explicitly frame the work as preliminary foundation for a pending grant rather than as a causal or clinical claim.</w:t>
       </w:r>
     </w:p>
     <w:p>
@@ -3049,6 +3063,20 @@
           <w:i w:val="0"/>
           <w:sz w:val="24"/>
         </w:rPr>
+        <w:t>Methods</w:t>
+      </w:r>
+    </w:p>
+    <w:p>
+      <w:pPr>
+        <w:spacing w:before="160" w:after="80"/>
+      </w:pPr>
+      <w:r>
+        <w:rPr>
+          <w:rFonts w:ascii="Times New Roman" w:hAnsi="Times New Roman"/>
+          <w:b/>
+          <w:i w:val="0"/>
+          <w:sz w:val="24"/>
+        </w:rPr>
         <w:t>Data curation</w:t>
       </w:r>
     </w:p>
@@ -3273,7 +3301,7 @@
           <w:i w:val="0"/>
           <w:sz w:val="22"/>
         </w:rPr>
-        <w:t xml:space="preserve"> A collapse-sensitivity meta-analysis merged GSE265957's two timepoints into a single contrast (five inputs); a bulk-only meta-analysis excluded GSE265957 entirely (four bulk studies; the same union-K≥3 definition as the primary was applied, so the sensitivity is method-identical to the six-input analysis except for the removal of the translatome study; core = 2,512 (union-K≥3 with bulk meta_FDR &lt; 0.05 and consistency ≥ 0.8); overlap with the six-input core = 2,202/4,055 = 54.3%, the primary core ∩ bulk-significant core under the bulk core's own consistency ≥ 0.8 gate (of which 1,707 are pure 4/4 and 495 are K = 3 only); applying the relaxed ≥3/4 concordance gate to the four-contrast set gives 3,587/4,055 = 88.5%, recovering 1,385 of the 1,853 genes outside the stricter overlap, with 313 primary-core genes lacking any bulk-study support (211 present-but-non-significant plus 102 absent from the four-bulk file); an earlier all-four-present (intersection) count of 1,981 is superseded). </w:t>
+        <w:t xml:space="preserve"> A collapse-sensitivity meta-analysis merged GSE265957's two timepoints into a single contrast (five inputs); a bulk-only meta-analysis excluded GSE265957 entirely (four bulk studies; the same union-K≥3 definition as the primary was applied, so the sensitivity is method-identical to the six-input analysis except for the removal of the translatome study; core = 2,512 (union-K≥3 with bulk meta_FDR &lt; 0.05 and consistency ≥ 0.8); overlap with the six-input core = 2,202/4,055 = 54.3%, the primary core ∩ bulk-significant core under the bulk core's own consistency ≥ 0.8 gate (of which 1,707 are pure 4/4 across all four available bulk contrasts, and a further 495 were measured in only three of the four bulk datasets with all three agreeing, K = 3 by availability); applying the relaxed ≥3/4 concordance gate to the four-contrast set gives 3,587/4,055 = 88.5%, recovering 1,385 of the 1,853 genes outside the stricter overlap, with 313 primary-core genes lacking any bulk-study support (211 present-but-non-significant plus 102 absent from the four-bulk file); an earlier all-four-present (intersection) count of 1,981 is superseded). </w:t>
       </w:r>
       <w:r>
         <w:rPr>
@@ -3291,7 +3319,7 @@
           <w:i w:val="0"/>
           <w:sz w:val="22"/>
         </w:rPr>
-        <w:t xml:space="preserve"> The GEO accession pools two incision-type postoperative pain models — skin/muscle incision and retraction (SMIR; n = 60 across DRG/muscle/skin) and lateral paw incision (LPI; n = 48) — and the 'chronic' contrast merges day-10 and day-32 samples (36 chronic vs 24 baseline at 0d). Harvest days are in fact annotated in the deposited metadata (0d, 6h, 2d, 10d, 32d). Because SMIR mechanical hypersensitivity has been reported to dissipate by postoperative day 32 (Flatters et al., 2008³⁷), the day-32 SMIR samples represent a resolving rather than established-chronic phenotype; their inclusion dilutes the injury signal and makes the incision contrast conservative. We therefore report the incision→nerve-injury translation as a conservative bound from a single, heterogeneous incision arm.</w:t>
+        <w:t xml:space="preserve"> The GEO accession pools two incision-type postoperative pain models — skin/muscle incision and retraction (SMIR; n = 60 across DRG/muscle/skin) and lateral paw incision (LPI; n = 48) — and the 'chronic' contrast merges day-10 and day-32 samples (36 chronic vs 24 baseline at 0d). Harvest days are in fact annotated in the deposited metadata (0d, 6h, 2d, 10d, 32d). Because SMIR mechanical hypersensitivity has been reported to dissipate by postoperative day 32 (Flatters et al., 2008³⁹), the day-32 SMIR samples represent a resolving rather than established-chronic phenotype; their inclusion dilutes the injury signal and makes the incision contrast conservative. We therefore report the incision→nerve-injury translation as a conservative bound from a single, heterogeneous incision arm.</w:t>
       </w:r>
     </w:p>
     <w:p>
@@ -3319,7 +3347,7 @@
           <w:i w:val="0"/>
           <w:sz w:val="22"/>
         </w:rPr>
-        <w:t>Nineteen a priori gene sets (neuroinflammation, DAM microglia, complement, mitochondrial OXPHOS, neuropeptides, synaptic, ion-channel families TRP/Nav/CACNA/Kv/KCNQ, MAPK, Sigma-1, opioid GPCR, ASIC, K2P/KCNK, myelin/oligodendrocyte, autophagy/mitophagy, CPSP-literature) were tested on the meta_Z vector by Stouffer combination plus one-sample t, calibrated by 2,000 same-size permutation tests with a resolution floor of 1/2001 ≈ 0.0005 (values at the floor are reported as an upper bound). Benjamini–Hochberg correction was applied across the 18 multi-member sets (permutation p and, separately, Stouffer p), because testing 19 sets without set-level correction leaves the three floor-pinned sets tied and ordered only by Stouffer Z; Sigma-1 is a single-member marker, is reported as such, and is excluded from set-level inference and ordering. Sets were also recomputed on the random-effects Z-vector. Set members and provenance are listed in Supplementary Table S5; the DAM_microglia set follows Keren-Shaul et al.²⁶. The gene-set definition was fixed a priori and not reinterpreted post hoc. The 18 multi-member gene sets overlap and are not independent; Benjamini–Hochberg correction is conservative under such dependence and is applied across the sets as a family-wise control, so the reported q-values are upper bounds on the per-set false-discovery rate.</w:t>
+        <w:t>Nineteen a priori gene sets (neuroinflammation, DAM microglia, complement, mitochondrial OXPHOS, neuropeptides, synaptic, ion-channel families TRP/Nav/CACNA/Kv/KCNQ, MAPK, Sigma-1, opioid GPCR, ASIC, K2P/KCNK, myelin/oligodendrocyte, autophagy/mitophagy, CPSP-literature) were tested on the meta_Z vector by Stouffer combination plus one-sample t, calibrated by 2,000 same-size permutation tests with a resolution floor of 1/2001 ≈ 0.0005 (values at the floor are reported as an upper bound). Benjamini–Hochberg correction was applied across the 18 multi-member sets (permutation p and, separately, Stouffer p), because testing 19 sets without set-level correction leaves the three floor-pinned sets tied and ordered only by Stouffer Z; Sigma-1 is a single-member marker, is reported as such, and is excluded from set-level inference and ordering. Sets were also recomputed on the random-effects Z-vector. Set members and provenance are listed in Supplementary Table S5; the DAM_microglia set follows Keren-Shaul et al.²⁷. The gene-set definition was fixed a priori and not reinterpreted post hoc. The 18 multi-member gene sets overlap and are not independent; Benjamini–Hochberg correction is conservative under such dependence and is applied across the sets as a family-wise control, so the reported q-values are upper bounds on the per-set false-discovery rate.</w:t>
       </w:r>
     </w:p>
     <w:p>
@@ -3532,6 +3560,29 @@
     </w:p>
     <w:p>
       <w:pPr>
+        <w:spacing w:before="0" w:after="40"/>
+      </w:pPr>
+      <w:r>
+        <w:rPr>
+          <w:rFonts w:ascii="Times New Roman" w:hAnsi="Times New Roman"/>
+          <w:b/>
+          <w:i w:val="0"/>
+          <w:sz w:val="22"/>
+        </w:rPr>
+        <w:t>Tissue scope of the hub set (DRG vs spinal).</w:t>
+      </w:r>
+      <w:r>
+        <w:rPr>
+          <w:rFonts w:ascii="Times New Roman" w:hAnsi="Times New Roman"/>
+          <w:b w:val="0"/>
+          <w:i w:val="0"/>
+          <w:sz w:val="22"/>
+        </w:rPr>
+        <w:t xml:space="preserve"> The Stouffer meta-analysis core (4,055 genes) is strictly DRG-derived: its six contrasts come from five studies (GSE267799, GSE212311, GSE278227, GSE241361 DRG, GSE265957 DRG) and no spinal-cord transcriptome entered that meta-analysis. The dual-ML hub set additionally pooled GSE241361 mouse spinal cord into the 72-sample training set alongside the four DRG datasets (GSE278227, GSE267799, GSE241361 DRG, GSE212311), so the 35 hubs reflect DRG-plus-spinal-cord expression convergence rather than a DRG-only signal; the remaining spinal datasets (GSE328175, GSE246288, GSE325938) were used for hub localisation only. We therefore describe the axis as a DRG-centred nerve-injury response with spinal-cord localisation, and we do not claim the hubs are DRG-exclusive.</w:t>
+      </w:r>
+    </w:p>
+    <w:p>
+      <w:pPr>
         <w:spacing w:before="160" w:after="80"/>
       </w:pPr>
       <w:r>
@@ -5081,7 +5132,7 @@
           <w:i w:val="0"/>
           <w:sz w:val="22"/>
         </w:rPr>
-        <w:t xml:space="preserve">26. Keren-Shaul, H. et al. A Unique Microglia Type Associated with Restricting Development of Alzheimer's Disease. </w:t>
+        <w:t xml:space="preserve">27. Keren-Shaul, H. et al. A Unique Microglia Type Associated with Restricting Development of Alzheimer's Disease. </w:t>
       </w:r>
       <w:r>
         <w:rPr>
@@ -5131,7 +5182,7 @@
           <w:i w:val="0"/>
           <w:sz w:val="22"/>
         </w:rPr>
-        <w:t xml:space="preserve">27. Schafer, D. P. et al. Microglia sculpt postnatal neural circuits in an activity and complement-dependent manner. </w:t>
+        <w:t xml:space="preserve">28. Schafer, D. P. et al. Microglia sculpt postnatal neural circuits in an activity and complement-dependent manner. </w:t>
       </w:r>
       <w:r>
         <w:rPr>
@@ -5181,7 +5232,7 @@
           <w:i w:val="0"/>
           <w:sz w:val="22"/>
         </w:rPr>
-        <w:t xml:space="preserve">28. Haque, M. M., Kuppusamy, P. &amp; Melemedjian, O. K. Disruption of mitochondrial pyruvate oxidation in dorsal root ganglia drives persistent nociceptive sensitization and causes pervasive transcriptomic alterations. </w:t>
+        <w:t xml:space="preserve">29. Haque, M. M., Kuppusamy, P. &amp; Melemedjian, O. K. Disruption of mitochondrial pyruvate oxidation in dorsal root ganglia drives persistent nociceptive sensitization and causes pervasive transcriptomic alterations. </w:t>
       </w:r>
       <w:r>
         <w:rPr>
@@ -5231,7 +5282,7 @@
           <w:i w:val="0"/>
           <w:sz w:val="22"/>
         </w:rPr>
-        <w:t xml:space="preserve">29. Yousefpour, N. et al. Targeting C1q prevents microglia-mediated synaptic removal in neuropathic pain. </w:t>
+        <w:t xml:space="preserve">30. Yousefpour, N. et al. Targeting C1q prevents microglia-mediated synaptic removal in neuropathic pain. </w:t>
       </w:r>
       <w:r>
         <w:rPr>
@@ -5281,7 +5332,7 @@
           <w:i w:val="0"/>
           <w:sz w:val="22"/>
         </w:rPr>
-        <w:t xml:space="preserve">30. Kong, E. et al. Lyn-mediated glycolysis enhancement of microglia contributes to neuropathic pain through facilitating IRF5 nuclear translocation in spinal dorsal horn. </w:t>
+        <w:t xml:space="preserve">31. Kong, E. et al. Lyn-mediated glycolysis enhancement of microglia contributes to neuropathic pain through facilitating IRF5 nuclear translocation in spinal dorsal horn. </w:t>
       </w:r>
       <w:r>
         <w:rPr>
@@ -5331,7 +5382,7 @@
           <w:i w:val="0"/>
           <w:sz w:val="22"/>
         </w:rPr>
-        <w:t xml:space="preserve">31. Scholz, J. &amp; Woolf, C. J. The neuropathic pain triad: neurons, immune cells and glia. </w:t>
+        <w:t xml:space="preserve">32. Scholz, J. &amp; Woolf, C. J. The neuropathic pain triad: neurons, immune cells and glia. </w:t>
       </w:r>
       <w:r>
         <w:rPr>
@@ -5381,7 +5432,7 @@
           <w:i w:val="0"/>
           <w:sz w:val="22"/>
         </w:rPr>
-        <w:t xml:space="preserve">32. Zhang, Y. et al. CXCL12/CXCR4 signaling-mediated ERK1/2 activation in spinal cord contributes to the pathogenesis of postsurgical pain in rats. </w:t>
+        <w:t xml:space="preserve">33. Zhang, Y. et al. CXCL12/CXCR4 signaling-mediated ERK1/2 activation in spinal cord contributes to the pathogenesis of postsurgical pain in rats. </w:t>
       </w:r>
       <w:r>
         <w:rPr>
@@ -5431,7 +5482,7 @@
           <w:i w:val="0"/>
           <w:sz w:val="22"/>
         </w:rPr>
-        <w:t xml:space="preserve">33. Luo, X. et al. Crosstalk between astrocytic CXCL12 and microglial CXCR4 contributes to the development of neuropathic pain. </w:t>
+        <w:t xml:space="preserve">34. Luo, X. et al. Crosstalk between astrocytic CXCL12 and microglial CXCR4 contributes to the development of neuropathic pain. </w:t>
       </w:r>
       <w:r>
         <w:rPr>
@@ -5481,7 +5532,7 @@
           <w:i w:val="0"/>
           <w:sz w:val="22"/>
         </w:rPr>
-        <w:t xml:space="preserve">34. Xiao, H. S. et al. Identification of gene expression profile of dorsal root ganglion in the rat peripheral axotomy model of neuropathic pain. </w:t>
+        <w:t xml:space="preserve">35. Xiao, H. S. et al. Identification of gene expression profile of dorsal root ganglion in the rat peripheral axotomy model of neuropathic pain. </w:t>
       </w:r>
       <w:r>
         <w:rPr>
@@ -5531,7 +5582,7 @@
           <w:i w:val="0"/>
           <w:sz w:val="22"/>
         </w:rPr>
-        <w:t xml:space="preserve">35. Pushpakom, S. et al. Drug repurposing: progress, challenges and recommendations. </w:t>
+        <w:t xml:space="preserve">36. Pushpakom, S. et al. Drug repurposing: progress, challenges and recommendations. </w:t>
       </w:r>
       <w:r>
         <w:rPr>
@@ -5581,7 +5632,7 @@
           <w:i w:val="0"/>
           <w:sz w:val="22"/>
         </w:rPr>
-        <w:t xml:space="preserve">36. Irwin, J. J. &amp; Shoichet, B. K. Docking screens for novel ligands conferring new biology. </w:t>
+        <w:t xml:space="preserve">37. Irwin, J. J. &amp; Shoichet, B. K. Docking screens for novel ligands conferring new biology. </w:t>
       </w:r>
       <w:r>
         <w:rPr>
@@ -5631,7 +5682,7 @@
           <w:i w:val="0"/>
           <w:sz w:val="22"/>
         </w:rPr>
-        <w:t xml:space="preserve">37. Flatters, S. J. Characterization of a model of persistent postoperative pain evoked by skin/muscle incision and retraction (SMIR). </w:t>
+        <w:t xml:space="preserve">39. Flatters, S. J. Characterization of a model of persistent postoperative pain evoked by skin/muscle incision and retraction (SMIR). </w:t>
       </w:r>
       <w:r>
         <w:rPr>
@@ -5668,6 +5719,106 @@
           <w:sz w:val="22"/>
         </w:rPr>
         <w:t>, 119–130 (2008). https://doi.org/10.1016/j.pain.2007.05.013</w:t>
+      </w:r>
+    </w:p>
+    <w:p>
+      <w:pPr>
+        <w:spacing w:before="0" w:after="40"/>
+      </w:pPr>
+      <w:r>
+        <w:rPr>
+          <w:rFonts w:ascii="Times New Roman" w:hAnsi="Times New Roman"/>
+          <w:b w:val="0"/>
+          <w:i w:val="0"/>
+          <w:sz w:val="22"/>
+        </w:rPr>
+        <w:t xml:space="preserve">38. Chen, J. et al. The α2δ-1–NMDA receptor complex is critically involved in neuropathic pain development and gabapentin therapeutic actions. </w:t>
+      </w:r>
+      <w:r>
+        <w:rPr>
+          <w:rFonts w:ascii="Times New Roman" w:hAnsi="Times New Roman"/>
+          <w:b w:val="0"/>
+          <w:i/>
+          <w:sz w:val="22"/>
+        </w:rPr>
+        <w:t>Cell Reports</w:t>
+      </w:r>
+      <w:r>
+        <w:rPr>
+          <w:rFonts w:ascii="Times New Roman" w:hAnsi="Times New Roman"/>
+          <w:b w:val="0"/>
+          <w:i w:val="0"/>
+          <w:sz w:val="22"/>
+        </w:rPr>
+        <w:t xml:space="preserve"> </w:t>
+      </w:r>
+      <w:r>
+        <w:rPr>
+          <w:rFonts w:ascii="Times New Roman" w:hAnsi="Times New Roman"/>
+          <w:b/>
+          <w:i w:val="0"/>
+          <w:sz w:val="22"/>
+        </w:rPr>
+        <w:t>22</w:t>
+      </w:r>
+      <w:r>
+        <w:rPr>
+          <w:rFonts w:ascii="Times New Roman" w:hAnsi="Times New Roman"/>
+          <w:b w:val="0"/>
+          <w:i w:val="0"/>
+          <w:sz w:val="22"/>
+        </w:rPr>
+        <w:t>, 2307–2321 (2018). https://doi.org/10.1016/j.celrep.2018.02.021</w:t>
+      </w:r>
+    </w:p>
+    <w:p>
+      <w:pPr>
+        <w:spacing w:before="0" w:after="40"/>
+      </w:pPr>
+      <w:r>
+        <w:rPr>
+          <w:rFonts w:ascii="Times New Roman" w:hAnsi="Times New Roman"/>
+          <w:b w:val="0"/>
+          <w:i w:val="0"/>
+          <w:sz w:val="22"/>
+        </w:rPr>
+        <w:t xml:space="preserve">26. Yu, X. et al. Dorsal root ganglion macrophages contribute to both the initiation and persistence of neuropathic pain. </w:t>
+      </w:r>
+      <w:r>
+        <w:rPr>
+          <w:rFonts w:ascii="Times New Roman" w:hAnsi="Times New Roman"/>
+          <w:b w:val="0"/>
+          <w:i/>
+          <w:sz w:val="22"/>
+        </w:rPr>
+        <w:t>Nature Communications</w:t>
+      </w:r>
+      <w:r>
+        <w:rPr>
+          <w:rFonts w:ascii="Times New Roman" w:hAnsi="Times New Roman"/>
+          <w:b w:val="0"/>
+          <w:i w:val="0"/>
+          <w:sz w:val="22"/>
+        </w:rPr>
+        <w:t xml:space="preserve"> </w:t>
+      </w:r>
+      <w:r>
+        <w:rPr>
+          <w:rFonts w:ascii="Times New Roman" w:hAnsi="Times New Roman"/>
+          <w:b/>
+          <w:i w:val="0"/>
+          <w:sz w:val="22"/>
+        </w:rPr>
+        <w:t>11</w:t>
+      </w:r>
+      <w:r>
+        <w:rPr>
+          <w:rFonts w:ascii="Times New Roman" w:hAnsi="Times New Roman"/>
+          <w:b w:val="0"/>
+          <w:i w:val="0"/>
+          <w:sz w:val="22"/>
+        </w:rPr>
+        <w:t>, 264 (2020). https://doi.org/10.1038/s41467-019-13839-2</w:t>
       </w:r>
     </w:p>
     <w:p>
@@ -5779,7 +5930,7 @@
           <w:i w:val="0"/>
           <w:sz w:val="22"/>
         </w:rPr>
-        <w:t xml:space="preserve">All code, tables and figures are version-controlled in the public GitHub repository at https://github.com/yyx-4113/cpsp-drg-spinal-repurposing. The 12 primary GEO accessions analysed here (GSE267799, GSE212311, GSE278227, GSE241361, GSE265957, GSE158825, GSE222979, GSE216039, GSE328175, GSE246288, GSE306403, GSE325938) are public and available from GEO. At submission the repository is released as version v1.2.0 (README + CITATION.cff + MIT LICENSE + reproduction scripts), and the derived tables enumerated below and in MANIFEST.sha256 are included in that release: meta-analysis tables, gene-set statistics with set-level correction, hub lists, docking scores, single-cell/spatial localisation tables, the bulk-only sensitivity output </w:t>
+        <w:t xml:space="preserve">All code, tables and figures are version-controlled in the public GitHub repository at https://github.com/yyx-4113/cpsp-drg-spinal-repurposing. The 12 primary GEO accessions analysed here (GSE267799, GSE212311, GSE278227, GSE241361, GSE265957, GSE158825, GSE222979, GSE216039, GSE328175, GSE246288, GSE306403, GSE325938) are public and available from GEO. At submission the repository is released as version v1.3.0 (README + CITATION.cff + MIT LICENSE + reproduction scripts), and the derived tables enumerated below and in MANIFEST.sha256 are included in that release: meta-analysis tables, gene-set statistics with set-level correction, hub lists, docking scores, single-cell/spatial localisation tables, the bulk-only sensitivity output </w:t>
       </w:r>
       <w:r>
         <w:rPr>
@@ -5919,7 +6070,7 @@
           <w:i w:val="0"/>
           <w:sz w:val="22"/>
         </w:rPr>
-        <w:t>The GitHub repository referenced above is released as a versioned, citable archive (v1.2.0; integrity verifiable via MANIFEST.sha256 and the accompanying CITATION.cff); no Zenodo snapshot has been deposited. Data are therefore available from the versioned GitHub release, not on request.</w:t>
+        <w:t>The GitHub repository referenced above is released as a versioned, citable archive (v1.3.0; integrity verifiable via MANIFEST.sha256 and the accompanying CITATION.cff); no Zenodo snapshot has been deposited. Data are therefore available from the versioned GitHub release, not on request.</w:t>
       </w:r>
     </w:p>
     <w:p>
@@ -7541,7 +7692,7 @@
           <w:i/>
           <w:sz w:val="18"/>
         </w:rPr>
-        <w:t>Table 2. Thirty-five candidate hub genes identified by the dual-machine-learning consensus (&gt;=2 of 3 methods: LASSO bootstrap, Random Forest mean-decrease-Gini, XGBoost |SHAP|). Methods (n/3) = number of methods flagging the gene; In meta core = membership in the 4,055-gene Stouffer meta signature (the in_meta_core boolean in P3_hub_genes.csv, rendered here as Yes/No). Source: P3_hub_genes.csv. Bootstrap stability caveat: a 200-resample bootstrap of the 72 pooled samples (P3_hub_bootstrap.csv) showed low per-gene recovery (max 15.5%, 0/35 at a &gt;=0.9 threshold; LASSO contributed no selections under resampling), so this set is a resampling-sensitive candidate list for prospective validation, not a rigidly locked set (see Results).</w:t>
+        <w:t>Table 2. Thirty-five candidate hub genes identified by the dual-machine-learning consensus (&gt;=2 of 3 methods: LASSO bootstrap, Random Forest mean-decrease-Gini, XGBoost |SHAP|). Methods (n/3) = number of methods flagging the gene; In meta core = membership in the 4,055-gene Stouffer meta signature (the in_meta_core boolean in P3_hub_genes.csv, rendered here as Yes/No). Source: P3_hub_genes.csv. Bootstrap stability caveat: a 200-resample bootstrap of the 72 pooled samples (P3_hub_bootstrap.csv) showed low per-gene recovery (max 100.0%, 2/35 at a &gt;=0.9 threshold: SPRR1A 1.00, ATF3 0.94); all three methods (LASSO, Random Forest, XGBoost) contributed selections under resampling, so the &gt;=2/3 consensus is not a two-method artefact), so this set is a resampling-sensitive candidate list for prospective validation, not a rigidly locked set (see Results).</w:t>
       </w:r>
     </w:p>
     <w:tbl>
@@ -7742,6 +7893,26 @@
                 <w:i w:val="0"/>
                 <w:sz w:val="17"/>
               </w:rPr>
+              <w:t>Yes</w:t>
+            </w:r>
+          </w:p>
+        </w:tc>
+        <w:tc>
+          <w:tcPr>
+            <w:tcW w:type="dxa" w:w="1560"/>
+          </w:tcPr>
+          <w:p>
+            <w:pPr>
+              <w:spacing w:line="240" w:lineRule="auto" w:before="20" w:after="20"/>
+            </w:pPr>
+            <w:r/>
+            <w:r>
+              <w:rPr>
+                <w:rFonts w:ascii="Times New Roman" w:hAnsi="Times New Roman"/>
+                <w:b w:val="0"/>
+                <w:i w:val="0"/>
+                <w:sz w:val="17"/>
+              </w:rPr>
               <w:t>0.96</w:t>
             </w:r>
           </w:p>
@@ -7783,26 +7954,6 @@
                 <w:sz w:val="17"/>
               </w:rPr>
               <w:t>1.0427</w:t>
-            </w:r>
-          </w:p>
-        </w:tc>
-        <w:tc>
-          <w:tcPr>
-            <w:tcW w:type="dxa" w:w="1560"/>
-          </w:tcPr>
-          <w:p>
-            <w:pPr>
-              <w:spacing w:line="240" w:lineRule="auto" w:before="20" w:after="20"/>
-            </w:pPr>
-            <w:r/>
-            <w:r>
-              <w:rPr>
-                <w:rFonts w:ascii="Times New Roman" w:hAnsi="Times New Roman"/>
-                <w:b w:val="0"/>
-                <w:i w:val="0"/>
-                <w:sz w:val="17"/>
-              </w:rPr>
-              <w:t>Yes</w:t>
             </w:r>
           </w:p>
         </w:tc>
@@ -7864,6 +8015,26 @@
                 <w:i w:val="0"/>
                 <w:sz w:val="17"/>
               </w:rPr>
+              <w:t>Yes</w:t>
+            </w:r>
+          </w:p>
+        </w:tc>
+        <w:tc>
+          <w:tcPr>
+            <w:tcW w:type="dxa" w:w="1560"/>
+          </w:tcPr>
+          <w:p>
+            <w:pPr>
+              <w:spacing w:line="240" w:lineRule="auto" w:before="20" w:after="20"/>
+            </w:pPr>
+            <w:r/>
+            <w:r>
+              <w:rPr>
+                <w:rFonts w:ascii="Times New Roman" w:hAnsi="Times New Roman"/>
+                <w:b w:val="0"/>
+                <w:i w:val="0"/>
+                <w:sz w:val="17"/>
+              </w:rPr>
               <w:t>0.85</w:t>
             </w:r>
           </w:p>
@@ -7905,26 +8076,6 @@
                 <w:sz w:val="17"/>
               </w:rPr>
               <w:t>0.1452</w:t>
-            </w:r>
-          </w:p>
-        </w:tc>
-        <w:tc>
-          <w:tcPr>
-            <w:tcW w:type="dxa" w:w="1560"/>
-          </w:tcPr>
-          <w:p>
-            <w:pPr>
-              <w:spacing w:line="240" w:lineRule="auto" w:before="20" w:after="20"/>
-            </w:pPr>
-            <w:r/>
-            <w:r>
-              <w:rPr>
-                <w:rFonts w:ascii="Times New Roman" w:hAnsi="Times New Roman"/>
-                <w:b w:val="0"/>
-                <w:i w:val="0"/>
-                <w:sz w:val="17"/>
-              </w:rPr>
-              <w:t>Yes</w:t>
             </w:r>
           </w:p>
         </w:tc>
@@ -7986,6 +8137,26 @@
                 <w:i w:val="0"/>
                 <w:sz w:val="17"/>
               </w:rPr>
+              <w:t>Yes</w:t>
+            </w:r>
+          </w:p>
+        </w:tc>
+        <w:tc>
+          <w:tcPr>
+            <w:tcW w:type="dxa" w:w="1560"/>
+          </w:tcPr>
+          <w:p>
+            <w:pPr>
+              <w:spacing w:line="240" w:lineRule="auto" w:before="20" w:after="20"/>
+            </w:pPr>
+            <w:r/>
+            <w:r>
+              <w:rPr>
+                <w:rFonts w:ascii="Times New Roman" w:hAnsi="Times New Roman"/>
+                <w:b w:val="0"/>
+                <w:i w:val="0"/>
+                <w:sz w:val="17"/>
+              </w:rPr>
               <w:t>0.62</w:t>
             </w:r>
           </w:p>
@@ -8027,26 +8198,6 @@
                 <w:sz w:val="17"/>
               </w:rPr>
               <w:t>0.2036</w:t>
-            </w:r>
-          </w:p>
-        </w:tc>
-        <w:tc>
-          <w:tcPr>
-            <w:tcW w:type="dxa" w:w="1560"/>
-          </w:tcPr>
-          <w:p>
-            <w:pPr>
-              <w:spacing w:line="240" w:lineRule="auto" w:before="20" w:after="20"/>
-            </w:pPr>
-            <w:r/>
-            <w:r>
-              <w:rPr>
-                <w:rFonts w:ascii="Times New Roman" w:hAnsi="Times New Roman"/>
-                <w:b w:val="0"/>
-                <w:i w:val="0"/>
-                <w:sz w:val="17"/>
-              </w:rPr>
-              <w:t>Yes</w:t>
             </w:r>
           </w:p>
         </w:tc>
@@ -8108,6 +8259,26 @@
                 <w:i w:val="0"/>
                 <w:sz w:val="17"/>
               </w:rPr>
+              <w:t>Yes</w:t>
+            </w:r>
+          </w:p>
+        </w:tc>
+        <w:tc>
+          <w:tcPr>
+            <w:tcW w:type="dxa" w:w="1560"/>
+          </w:tcPr>
+          <w:p>
+            <w:pPr>
+              <w:spacing w:line="240" w:lineRule="auto" w:before="20" w:after="20"/>
+            </w:pPr>
+            <w:r/>
+            <w:r>
+              <w:rPr>
+                <w:rFonts w:ascii="Times New Roman" w:hAnsi="Times New Roman"/>
+                <w:b w:val="0"/>
+                <w:i w:val="0"/>
+                <w:sz w:val="17"/>
+              </w:rPr>
               <w:t>0.79</w:t>
             </w:r>
           </w:p>
@@ -8149,26 +8320,6 @@
                 <w:sz w:val="17"/>
               </w:rPr>
               <w:t>0.3193</w:t>
-            </w:r>
-          </w:p>
-        </w:tc>
-        <w:tc>
-          <w:tcPr>
-            <w:tcW w:type="dxa" w:w="1560"/>
-          </w:tcPr>
-          <w:p>
-            <w:pPr>
-              <w:spacing w:line="240" w:lineRule="auto" w:before="20" w:after="20"/>
-            </w:pPr>
-            <w:r/>
-            <w:r>
-              <w:rPr>
-                <w:rFonts w:ascii="Times New Roman" w:hAnsi="Times New Roman"/>
-                <w:b w:val="0"/>
-                <w:i w:val="0"/>
-                <w:sz w:val="17"/>
-              </w:rPr>
-              <w:t>Yes</w:t>
             </w:r>
           </w:p>
         </w:tc>
@@ -8230,6 +8381,26 @@
                 <w:i w:val="0"/>
                 <w:sz w:val="17"/>
               </w:rPr>
+              <w:t>Yes</w:t>
+            </w:r>
+          </w:p>
+        </w:tc>
+        <w:tc>
+          <w:tcPr>
+            <w:tcW w:type="dxa" w:w="1560"/>
+          </w:tcPr>
+          <w:p>
+            <w:pPr>
+              <w:spacing w:line="240" w:lineRule="auto" w:before="20" w:after="20"/>
+            </w:pPr>
+            <w:r/>
+            <w:r>
+              <w:rPr>
+                <w:rFonts w:ascii="Times New Roman" w:hAnsi="Times New Roman"/>
+                <w:b w:val="0"/>
+                <w:i w:val="0"/>
+                <w:sz w:val="17"/>
+              </w:rPr>
               <w:t>0.78</w:t>
             </w:r>
           </w:p>
@@ -8271,26 +8442,6 @@
                 <w:sz w:val="17"/>
               </w:rPr>
               <w:t>0.0450</w:t>
-            </w:r>
-          </w:p>
-        </w:tc>
-        <w:tc>
-          <w:tcPr>
-            <w:tcW w:type="dxa" w:w="1560"/>
-          </w:tcPr>
-          <w:p>
-            <w:pPr>
-              <w:spacing w:line="240" w:lineRule="auto" w:before="20" w:after="20"/>
-            </w:pPr>
-            <w:r/>
-            <w:r>
-              <w:rPr>
-                <w:rFonts w:ascii="Times New Roman" w:hAnsi="Times New Roman"/>
-                <w:b w:val="0"/>
-                <w:i w:val="0"/>
-                <w:sz w:val="17"/>
-              </w:rPr>
-              <w:t>Yes</w:t>
             </w:r>
           </w:p>
         </w:tc>
@@ -8352,6 +8503,26 @@
                 <w:i w:val="0"/>
                 <w:sz w:val="17"/>
               </w:rPr>
+              <w:t>Yes</w:t>
+            </w:r>
+          </w:p>
+        </w:tc>
+        <w:tc>
+          <w:tcPr>
+            <w:tcW w:type="dxa" w:w="1560"/>
+          </w:tcPr>
+          <w:p>
+            <w:pPr>
+              <w:spacing w:line="240" w:lineRule="auto" w:before="20" w:after="20"/>
+            </w:pPr>
+            <w:r/>
+            <w:r>
+              <w:rPr>
+                <w:rFonts w:ascii="Times New Roman" w:hAnsi="Times New Roman"/>
+                <w:b w:val="0"/>
+                <w:i w:val="0"/>
+                <w:sz w:val="17"/>
+              </w:rPr>
               <w:t>0.06</w:t>
             </w:r>
           </w:p>
@@ -8393,26 +8564,6 @@
                 <w:sz w:val="17"/>
               </w:rPr>
               <w:t>0.1204</w:t>
-            </w:r>
-          </w:p>
-        </w:tc>
-        <w:tc>
-          <w:tcPr>
-            <w:tcW w:type="dxa" w:w="1560"/>
-          </w:tcPr>
-          <w:p>
-            <w:pPr>
-              <w:spacing w:line="240" w:lineRule="auto" w:before="20" w:after="20"/>
-            </w:pPr>
-            <w:r/>
-            <w:r>
-              <w:rPr>
-                <w:rFonts w:ascii="Times New Roman" w:hAnsi="Times New Roman"/>
-                <w:b w:val="0"/>
-                <w:i w:val="0"/>
-                <w:sz w:val="17"/>
-              </w:rPr>
-              <w:t>Yes</w:t>
             </w:r>
           </w:p>
         </w:tc>
@@ -8474,6 +8625,26 @@
                 <w:i w:val="0"/>
                 <w:sz w:val="17"/>
               </w:rPr>
+              <w:t>Yes</w:t>
+            </w:r>
+          </w:p>
+        </w:tc>
+        <w:tc>
+          <w:tcPr>
+            <w:tcW w:type="dxa" w:w="1560"/>
+          </w:tcPr>
+          <w:p>
+            <w:pPr>
+              <w:spacing w:line="240" w:lineRule="auto" w:before="20" w:after="20"/>
+            </w:pPr>
+            <w:r/>
+            <w:r>
+              <w:rPr>
+                <w:rFonts w:ascii="Times New Roman" w:hAnsi="Times New Roman"/>
+                <w:b w:val="0"/>
+                <w:i w:val="0"/>
+                <w:sz w:val="17"/>
+              </w:rPr>
               <w:t>0.04</w:t>
             </w:r>
           </w:p>
@@ -8515,26 +8686,6 @@
                 <w:sz w:val="17"/>
               </w:rPr>
               <w:t>0.3398</w:t>
-            </w:r>
-          </w:p>
-        </w:tc>
-        <w:tc>
-          <w:tcPr>
-            <w:tcW w:type="dxa" w:w="1560"/>
-          </w:tcPr>
-          <w:p>
-            <w:pPr>
-              <w:spacing w:line="240" w:lineRule="auto" w:before="20" w:after="20"/>
-            </w:pPr>
-            <w:r/>
-            <w:r>
-              <w:rPr>
-                <w:rFonts w:ascii="Times New Roman" w:hAnsi="Times New Roman"/>
-                <w:b w:val="0"/>
-                <w:i w:val="0"/>
-                <w:sz w:val="17"/>
-              </w:rPr>
-              <w:t>Yes</w:t>
             </w:r>
           </w:p>
         </w:tc>
@@ -8596,6 +8747,26 @@
                 <w:i w:val="0"/>
                 <w:sz w:val="17"/>
               </w:rPr>
+              <w:t>Yes</w:t>
+            </w:r>
+          </w:p>
+        </w:tc>
+        <w:tc>
+          <w:tcPr>
+            <w:tcW w:type="dxa" w:w="1560"/>
+          </w:tcPr>
+          <w:p>
+            <w:pPr>
+              <w:spacing w:line="240" w:lineRule="auto" w:before="20" w:after="20"/>
+            </w:pPr>
+            <w:r/>
+            <w:r>
+              <w:rPr>
+                <w:rFonts w:ascii="Times New Roman" w:hAnsi="Times New Roman"/>
+                <w:b w:val="0"/>
+                <w:i w:val="0"/>
+                <w:sz w:val="17"/>
+              </w:rPr>
               <w:t>0.03</w:t>
             </w:r>
           </w:p>
@@ -8637,26 +8808,6 @@
                 <w:sz w:val="17"/>
               </w:rPr>
               <w:t>0.5359</w:t>
-            </w:r>
-          </w:p>
-        </w:tc>
-        <w:tc>
-          <w:tcPr>
-            <w:tcW w:type="dxa" w:w="1560"/>
-          </w:tcPr>
-          <w:p>
-            <w:pPr>
-              <w:spacing w:line="240" w:lineRule="auto" w:before="20" w:after="20"/>
-            </w:pPr>
-            <w:r/>
-            <w:r>
-              <w:rPr>
-                <w:rFonts w:ascii="Times New Roman" w:hAnsi="Times New Roman"/>
-                <w:b w:val="0"/>
-                <w:i w:val="0"/>
-                <w:sz w:val="17"/>
-              </w:rPr>
-              <w:t>Yes</w:t>
             </w:r>
           </w:p>
         </w:tc>
@@ -8718,6 +8869,26 @@
                 <w:i w:val="0"/>
                 <w:sz w:val="17"/>
               </w:rPr>
+              <w:t>Yes</w:t>
+            </w:r>
+          </w:p>
+        </w:tc>
+        <w:tc>
+          <w:tcPr>
+            <w:tcW w:type="dxa" w:w="1560"/>
+          </w:tcPr>
+          <w:p>
+            <w:pPr>
+              <w:spacing w:line="240" w:lineRule="auto" w:before="20" w:after="20"/>
+            </w:pPr>
+            <w:r/>
+            <w:r>
+              <w:rPr>
+                <w:rFonts w:ascii="Times New Roman" w:hAnsi="Times New Roman"/>
+                <w:b w:val="0"/>
+                <w:i w:val="0"/>
+                <w:sz w:val="17"/>
+              </w:rPr>
               <w:t>0.38</w:t>
             </w:r>
           </w:p>
@@ -8759,26 +8930,6 @@
                 <w:sz w:val="17"/>
               </w:rPr>
               <w:t>0.0797</w:t>
-            </w:r>
-          </w:p>
-        </w:tc>
-        <w:tc>
-          <w:tcPr>
-            <w:tcW w:type="dxa" w:w="1560"/>
-          </w:tcPr>
-          <w:p>
-            <w:pPr>
-              <w:spacing w:line="240" w:lineRule="auto" w:before="20" w:after="20"/>
-            </w:pPr>
-            <w:r/>
-            <w:r>
-              <w:rPr>
-                <w:rFonts w:ascii="Times New Roman" w:hAnsi="Times New Roman"/>
-                <w:b w:val="0"/>
-                <w:i w:val="0"/>
-                <w:sz w:val="17"/>
-              </w:rPr>
-              <w:t>Yes</w:t>
             </w:r>
           </w:p>
         </w:tc>
@@ -8840,6 +8991,26 @@
                 <w:i w:val="0"/>
                 <w:sz w:val="17"/>
               </w:rPr>
+              <w:t>Yes</w:t>
+            </w:r>
+          </w:p>
+        </w:tc>
+        <w:tc>
+          <w:tcPr>
+            <w:tcW w:type="dxa" w:w="1560"/>
+          </w:tcPr>
+          <w:p>
+            <w:pPr>
+              <w:spacing w:line="240" w:lineRule="auto" w:before="20" w:after="20"/>
+            </w:pPr>
+            <w:r/>
+            <w:r>
+              <w:rPr>
+                <w:rFonts w:ascii="Times New Roman" w:hAnsi="Times New Roman"/>
+                <w:b w:val="0"/>
+                <w:i w:val="0"/>
+                <w:sz w:val="17"/>
+              </w:rPr>
               <w:t>0.17</w:t>
             </w:r>
           </w:p>
@@ -8881,26 +9052,6 @@
                 <w:sz w:val="17"/>
               </w:rPr>
               <w:t>0.1288</w:t>
-            </w:r>
-          </w:p>
-        </w:tc>
-        <w:tc>
-          <w:tcPr>
-            <w:tcW w:type="dxa" w:w="1560"/>
-          </w:tcPr>
-          <w:p>
-            <w:pPr>
-              <w:spacing w:line="240" w:lineRule="auto" w:before="20" w:after="20"/>
-            </w:pPr>
-            <w:r/>
-            <w:r>
-              <w:rPr>
-                <w:rFonts w:ascii="Times New Roman" w:hAnsi="Times New Roman"/>
-                <w:b w:val="0"/>
-                <w:i w:val="0"/>
-                <w:sz w:val="17"/>
-              </w:rPr>
-              <w:t>Yes</w:t>
             </w:r>
           </w:p>
         </w:tc>
@@ -8962,6 +9113,26 @@
                 <w:i w:val="0"/>
                 <w:sz w:val="17"/>
               </w:rPr>
+              <w:t>Yes</w:t>
+            </w:r>
+          </w:p>
+        </w:tc>
+        <w:tc>
+          <w:tcPr>
+            <w:tcW w:type="dxa" w:w="1560"/>
+          </w:tcPr>
+          <w:p>
+            <w:pPr>
+              <w:spacing w:line="240" w:lineRule="auto" w:before="20" w:after="20"/>
+            </w:pPr>
+            <w:r/>
+            <w:r>
+              <w:rPr>
+                <w:rFonts w:ascii="Times New Roman" w:hAnsi="Times New Roman"/>
+                <w:b w:val="0"/>
+                <w:i w:val="0"/>
+                <w:sz w:val="17"/>
+              </w:rPr>
               <w:t>0.07</w:t>
             </w:r>
           </w:p>
@@ -9003,26 +9174,6 @@
                 <w:sz w:val="17"/>
               </w:rPr>
               <w:t>0.1196</w:t>
-            </w:r>
-          </w:p>
-        </w:tc>
-        <w:tc>
-          <w:tcPr>
-            <w:tcW w:type="dxa" w:w="1560"/>
-          </w:tcPr>
-          <w:p>
-            <w:pPr>
-              <w:spacing w:line="240" w:lineRule="auto" w:before="20" w:after="20"/>
-            </w:pPr>
-            <w:r/>
-            <w:r>
-              <w:rPr>
-                <w:rFonts w:ascii="Times New Roman" w:hAnsi="Times New Roman"/>
-                <w:b w:val="0"/>
-                <w:i w:val="0"/>
-                <w:sz w:val="17"/>
-              </w:rPr>
-              <w:t>Yes</w:t>
             </w:r>
           </w:p>
         </w:tc>
@@ -9084,6 +9235,26 @@
                 <w:i w:val="0"/>
                 <w:sz w:val="17"/>
               </w:rPr>
+              <w:t>Yes</w:t>
+            </w:r>
+          </w:p>
+        </w:tc>
+        <w:tc>
+          <w:tcPr>
+            <w:tcW w:type="dxa" w:w="1560"/>
+          </w:tcPr>
+          <w:p>
+            <w:pPr>
+              <w:spacing w:line="240" w:lineRule="auto" w:before="20" w:after="20"/>
+            </w:pPr>
+            <w:r/>
+            <w:r>
+              <w:rPr>
+                <w:rFonts w:ascii="Times New Roman" w:hAnsi="Times New Roman"/>
+                <w:b w:val="0"/>
+                <w:i w:val="0"/>
+                <w:sz w:val="17"/>
+              </w:rPr>
               <w:t>0.50</w:t>
             </w:r>
           </w:p>
@@ -9125,26 +9296,6 @@
                 <w:sz w:val="17"/>
               </w:rPr>
               <w:t>0.0920</w:t>
-            </w:r>
-          </w:p>
-        </w:tc>
-        <w:tc>
-          <w:tcPr>
-            <w:tcW w:type="dxa" w:w="1560"/>
-          </w:tcPr>
-          <w:p>
-            <w:pPr>
-              <w:spacing w:line="240" w:lineRule="auto" w:before="20" w:after="20"/>
-            </w:pPr>
-            <w:r/>
-            <w:r>
-              <w:rPr>
-                <w:rFonts w:ascii="Times New Roman" w:hAnsi="Times New Roman"/>
-                <w:b w:val="0"/>
-                <w:i w:val="0"/>
-                <w:sz w:val="17"/>
-              </w:rPr>
-              <w:t>Yes</w:t>
             </w:r>
           </w:p>
         </w:tc>
@@ -9206,6 +9357,26 @@
                 <w:i w:val="0"/>
                 <w:sz w:val="17"/>
               </w:rPr>
+              <w:t>Yes</w:t>
+            </w:r>
+          </w:p>
+        </w:tc>
+        <w:tc>
+          <w:tcPr>
+            <w:tcW w:type="dxa" w:w="1560"/>
+          </w:tcPr>
+          <w:p>
+            <w:pPr>
+              <w:spacing w:line="240" w:lineRule="auto" w:before="20" w:after="20"/>
+            </w:pPr>
+            <w:r/>
+            <w:r>
+              <w:rPr>
+                <w:rFonts w:ascii="Times New Roman" w:hAnsi="Times New Roman"/>
+                <w:b w:val="0"/>
+                <w:i w:val="0"/>
+                <w:sz w:val="17"/>
+              </w:rPr>
               <w:t>0.01</w:t>
             </w:r>
           </w:p>
@@ -9247,26 +9418,6 @@
                 <w:sz w:val="17"/>
               </w:rPr>
               <w:t>0.0575</w:t>
-            </w:r>
-          </w:p>
-        </w:tc>
-        <w:tc>
-          <w:tcPr>
-            <w:tcW w:type="dxa" w:w="1560"/>
-          </w:tcPr>
-          <w:p>
-            <w:pPr>
-              <w:spacing w:line="240" w:lineRule="auto" w:before="20" w:after="20"/>
-            </w:pPr>
-            <w:r/>
-            <w:r>
-              <w:rPr>
-                <w:rFonts w:ascii="Times New Roman" w:hAnsi="Times New Roman"/>
-                <w:b w:val="0"/>
-                <w:i w:val="0"/>
-                <w:sz w:val="17"/>
-              </w:rPr>
-              <w:t>Yes</w:t>
             </w:r>
           </w:p>
         </w:tc>
@@ -9328,6 +9479,26 @@
                 <w:i w:val="0"/>
                 <w:sz w:val="17"/>
               </w:rPr>
+              <w:t>Yes</w:t>
+            </w:r>
+          </w:p>
+        </w:tc>
+        <w:tc>
+          <w:tcPr>
+            <w:tcW w:type="dxa" w:w="1560"/>
+          </w:tcPr>
+          <w:p>
+            <w:pPr>
+              <w:spacing w:line="240" w:lineRule="auto" w:before="20" w:after="20"/>
+            </w:pPr>
+            <w:r/>
+            <w:r>
+              <w:rPr>
+                <w:rFonts w:ascii="Times New Roman" w:hAnsi="Times New Roman"/>
+                <w:b w:val="0"/>
+                <w:i w:val="0"/>
+                <w:sz w:val="17"/>
+              </w:rPr>
               <w:t>0.00</w:t>
             </w:r>
           </w:p>
@@ -9369,26 +9540,6 @@
                 <w:sz w:val="17"/>
               </w:rPr>
               <w:t>0.1053</w:t>
-            </w:r>
-          </w:p>
-        </w:tc>
-        <w:tc>
-          <w:tcPr>
-            <w:tcW w:type="dxa" w:w="1560"/>
-          </w:tcPr>
-          <w:p>
-            <w:pPr>
-              <w:spacing w:line="240" w:lineRule="auto" w:before="20" w:after="20"/>
-            </w:pPr>
-            <w:r/>
-            <w:r>
-              <w:rPr>
-                <w:rFonts w:ascii="Times New Roman" w:hAnsi="Times New Roman"/>
-                <w:b w:val="0"/>
-                <w:i w:val="0"/>
-                <w:sz w:val="17"/>
-              </w:rPr>
-              <w:t>Yes</w:t>
             </w:r>
           </w:p>
         </w:tc>
@@ -9450,6 +9601,26 @@
                 <w:i w:val="0"/>
                 <w:sz w:val="17"/>
               </w:rPr>
+              <w:t>Yes</w:t>
+            </w:r>
+          </w:p>
+        </w:tc>
+        <w:tc>
+          <w:tcPr>
+            <w:tcW w:type="dxa" w:w="1560"/>
+          </w:tcPr>
+          <w:p>
+            <w:pPr>
+              <w:spacing w:line="240" w:lineRule="auto" w:before="20" w:after="20"/>
+            </w:pPr>
+            <w:r/>
+            <w:r>
+              <w:rPr>
+                <w:rFonts w:ascii="Times New Roman" w:hAnsi="Times New Roman"/>
+                <w:b w:val="0"/>
+                <w:i w:val="0"/>
+                <w:sz w:val="17"/>
+              </w:rPr>
               <w:t>0.11</w:t>
             </w:r>
           </w:p>
@@ -9491,26 +9662,6 @@
                 <w:sz w:val="17"/>
               </w:rPr>
               <w:t>0.0490</w:t>
-            </w:r>
-          </w:p>
-        </w:tc>
-        <w:tc>
-          <w:tcPr>
-            <w:tcW w:type="dxa" w:w="1560"/>
-          </w:tcPr>
-          <w:p>
-            <w:pPr>
-              <w:spacing w:line="240" w:lineRule="auto" w:before="20" w:after="20"/>
-            </w:pPr>
-            <w:r/>
-            <w:r>
-              <w:rPr>
-                <w:rFonts w:ascii="Times New Roman" w:hAnsi="Times New Roman"/>
-                <w:b w:val="0"/>
-                <w:i w:val="0"/>
-                <w:sz w:val="17"/>
-              </w:rPr>
-              <w:t>Yes</w:t>
             </w:r>
           </w:p>
         </w:tc>
@@ -9572,6 +9723,26 @@
                 <w:i w:val="0"/>
                 <w:sz w:val="17"/>
               </w:rPr>
+              <w:t>Yes</w:t>
+            </w:r>
+          </w:p>
+        </w:tc>
+        <w:tc>
+          <w:tcPr>
+            <w:tcW w:type="dxa" w:w="1560"/>
+          </w:tcPr>
+          <w:p>
+            <w:pPr>
+              <w:spacing w:line="240" w:lineRule="auto" w:before="20" w:after="20"/>
+            </w:pPr>
+            <w:r/>
+            <w:r>
+              <w:rPr>
+                <w:rFonts w:ascii="Times New Roman" w:hAnsi="Times New Roman"/>
+                <w:b w:val="0"/>
+                <w:i w:val="0"/>
+                <w:sz w:val="17"/>
+              </w:rPr>
               <w:t>0.25</w:t>
             </w:r>
           </w:p>
@@ -9613,26 +9784,6 @@
                 <w:sz w:val="17"/>
               </w:rPr>
               <w:t>0.0440</w:t>
-            </w:r>
-          </w:p>
-        </w:tc>
-        <w:tc>
-          <w:tcPr>
-            <w:tcW w:type="dxa" w:w="1560"/>
-          </w:tcPr>
-          <w:p>
-            <w:pPr>
-              <w:spacing w:line="240" w:lineRule="auto" w:before="20" w:after="20"/>
-            </w:pPr>
-            <w:r/>
-            <w:r>
-              <w:rPr>
-                <w:rFonts w:ascii="Times New Roman" w:hAnsi="Times New Roman"/>
-                <w:b w:val="0"/>
-                <w:i w:val="0"/>
-                <w:sz w:val="17"/>
-              </w:rPr>
-              <w:t>Yes</w:t>
             </w:r>
           </w:p>
         </w:tc>
@@ -9694,6 +9845,26 @@
                 <w:i w:val="0"/>
                 <w:sz w:val="17"/>
               </w:rPr>
+              <w:t>Yes</w:t>
+            </w:r>
+          </w:p>
+        </w:tc>
+        <w:tc>
+          <w:tcPr>
+            <w:tcW w:type="dxa" w:w="1560"/>
+          </w:tcPr>
+          <w:p>
+            <w:pPr>
+              <w:spacing w:line="240" w:lineRule="auto" w:before="20" w:after="20"/>
+            </w:pPr>
+            <w:r/>
+            <w:r>
+              <w:rPr>
+                <w:rFonts w:ascii="Times New Roman" w:hAnsi="Times New Roman"/>
+                <w:b w:val="0"/>
+                <w:i w:val="0"/>
+                <w:sz w:val="17"/>
+              </w:rPr>
               <w:t>0.39</w:t>
             </w:r>
           </w:p>
@@ -9735,26 +9906,6 @@
                 <w:sz w:val="17"/>
               </w:rPr>
               <w:t>0.0345</w:t>
-            </w:r>
-          </w:p>
-        </w:tc>
-        <w:tc>
-          <w:tcPr>
-            <w:tcW w:type="dxa" w:w="1560"/>
-          </w:tcPr>
-          <w:p>
-            <w:pPr>
-              <w:spacing w:line="240" w:lineRule="auto" w:before="20" w:after="20"/>
-            </w:pPr>
-            <w:r/>
-            <w:r>
-              <w:rPr>
-                <w:rFonts w:ascii="Times New Roman" w:hAnsi="Times New Roman"/>
-                <w:b w:val="0"/>
-                <w:i w:val="0"/>
-                <w:sz w:val="17"/>
-              </w:rPr>
-              <w:t>Yes</w:t>
             </w:r>
           </w:p>
         </w:tc>
@@ -9816,6 +9967,26 @@
                 <w:i w:val="0"/>
                 <w:sz w:val="17"/>
               </w:rPr>
+              <w:t>Yes</w:t>
+            </w:r>
+          </w:p>
+        </w:tc>
+        <w:tc>
+          <w:tcPr>
+            <w:tcW w:type="dxa" w:w="1560"/>
+          </w:tcPr>
+          <w:p>
+            <w:pPr>
+              <w:spacing w:line="240" w:lineRule="auto" w:before="20" w:after="20"/>
+            </w:pPr>
+            <w:r/>
+            <w:r>
+              <w:rPr>
+                <w:rFonts w:ascii="Times New Roman" w:hAnsi="Times New Roman"/>
+                <w:b w:val="0"/>
+                <w:i w:val="0"/>
+                <w:sz w:val="17"/>
+              </w:rPr>
               <w:t>0.41</w:t>
             </w:r>
           </w:p>
@@ -9857,26 +10028,6 @@
                 <w:sz w:val="17"/>
               </w:rPr>
               <w:t>0.0785</w:t>
-            </w:r>
-          </w:p>
-        </w:tc>
-        <w:tc>
-          <w:tcPr>
-            <w:tcW w:type="dxa" w:w="1560"/>
-          </w:tcPr>
-          <w:p>
-            <w:pPr>
-              <w:spacing w:line="240" w:lineRule="auto" w:before="20" w:after="20"/>
-            </w:pPr>
-            <w:r/>
-            <w:r>
-              <w:rPr>
-                <w:rFonts w:ascii="Times New Roman" w:hAnsi="Times New Roman"/>
-                <w:b w:val="0"/>
-                <w:i w:val="0"/>
-                <w:sz w:val="17"/>
-              </w:rPr>
-              <w:t>Yes</w:t>
             </w:r>
           </w:p>
         </w:tc>
@@ -9938,6 +10089,26 @@
                 <w:i w:val="0"/>
                 <w:sz w:val="17"/>
               </w:rPr>
+              <w:t>Yes</w:t>
+            </w:r>
+          </w:p>
+        </w:tc>
+        <w:tc>
+          <w:tcPr>
+            <w:tcW w:type="dxa" w:w="1560"/>
+          </w:tcPr>
+          <w:p>
+            <w:pPr>
+              <w:spacing w:line="240" w:lineRule="auto" w:before="20" w:after="20"/>
+            </w:pPr>
+            <w:r/>
+            <w:r>
+              <w:rPr>
+                <w:rFonts w:ascii="Times New Roman" w:hAnsi="Times New Roman"/>
+                <w:b w:val="0"/>
+                <w:i w:val="0"/>
+                <w:sz w:val="17"/>
+              </w:rPr>
               <w:t>0.08</w:t>
             </w:r>
           </w:p>
@@ -9979,26 +10150,6 @@
                 <w:sz w:val="17"/>
               </w:rPr>
               <w:t>0.0145</w:t>
-            </w:r>
-          </w:p>
-        </w:tc>
-        <w:tc>
-          <w:tcPr>
-            <w:tcW w:type="dxa" w:w="1560"/>
-          </w:tcPr>
-          <w:p>
-            <w:pPr>
-              <w:spacing w:line="240" w:lineRule="auto" w:before="20" w:after="20"/>
-            </w:pPr>
-            <w:r/>
-            <w:r>
-              <w:rPr>
-                <w:rFonts w:ascii="Times New Roman" w:hAnsi="Times New Roman"/>
-                <w:b w:val="0"/>
-                <w:i w:val="0"/>
-                <w:sz w:val="17"/>
-              </w:rPr>
-              <w:t>Yes</w:t>
             </w:r>
           </w:p>
         </w:tc>
@@ -10060,6 +10211,26 @@
                 <w:i w:val="0"/>
                 <w:sz w:val="17"/>
               </w:rPr>
+              <w:t>Yes</w:t>
+            </w:r>
+          </w:p>
+        </w:tc>
+        <w:tc>
+          <w:tcPr>
+            <w:tcW w:type="dxa" w:w="1560"/>
+          </w:tcPr>
+          <w:p>
+            <w:pPr>
+              <w:spacing w:line="240" w:lineRule="auto" w:before="20" w:after="20"/>
+            </w:pPr>
+            <w:r/>
+            <w:r>
+              <w:rPr>
+                <w:rFonts w:ascii="Times New Roman" w:hAnsi="Times New Roman"/>
+                <w:b w:val="0"/>
+                <w:i w:val="0"/>
+                <w:sz w:val="17"/>
+              </w:rPr>
               <w:t>0.00</w:t>
             </w:r>
           </w:p>
@@ -10101,26 +10272,6 @@
                 <w:sz w:val="17"/>
               </w:rPr>
               <w:t>0.0000</w:t>
-            </w:r>
-          </w:p>
-        </w:tc>
-        <w:tc>
-          <w:tcPr>
-            <w:tcW w:type="dxa" w:w="1560"/>
-          </w:tcPr>
-          <w:p>
-            <w:pPr>
-              <w:spacing w:line="240" w:lineRule="auto" w:before="20" w:after="20"/>
-            </w:pPr>
-            <w:r/>
-            <w:r>
-              <w:rPr>
-                <w:rFonts w:ascii="Times New Roman" w:hAnsi="Times New Roman"/>
-                <w:b w:val="0"/>
-                <w:i w:val="0"/>
-                <w:sz w:val="17"/>
-              </w:rPr>
-              <w:t>Yes</w:t>
             </w:r>
           </w:p>
         </w:tc>
@@ -10182,6 +10333,26 @@
                 <w:i w:val="0"/>
                 <w:sz w:val="17"/>
               </w:rPr>
+              <w:t>Yes</w:t>
+            </w:r>
+          </w:p>
+        </w:tc>
+        <w:tc>
+          <w:tcPr>
+            <w:tcW w:type="dxa" w:w="1560"/>
+          </w:tcPr>
+          <w:p>
+            <w:pPr>
+              <w:spacing w:line="240" w:lineRule="auto" w:before="20" w:after="20"/>
+            </w:pPr>
+            <w:r/>
+            <w:r>
+              <w:rPr>
+                <w:rFonts w:ascii="Times New Roman" w:hAnsi="Times New Roman"/>
+                <w:b w:val="0"/>
+                <w:i w:val="0"/>
+                <w:sz w:val="17"/>
+              </w:rPr>
               <w:t>0.05</w:t>
             </w:r>
           </w:p>
@@ -10223,26 +10394,6 @@
                 <w:sz w:val="17"/>
               </w:rPr>
               <w:t>0.1275</w:t>
-            </w:r>
-          </w:p>
-        </w:tc>
-        <w:tc>
-          <w:tcPr>
-            <w:tcW w:type="dxa" w:w="1560"/>
-          </w:tcPr>
-          <w:p>
-            <w:pPr>
-              <w:spacing w:line="240" w:lineRule="auto" w:before="20" w:after="20"/>
-            </w:pPr>
-            <w:r/>
-            <w:r>
-              <w:rPr>
-                <w:rFonts w:ascii="Times New Roman" w:hAnsi="Times New Roman"/>
-                <w:b w:val="0"/>
-                <w:i w:val="0"/>
-                <w:sz w:val="17"/>
-              </w:rPr>
-              <w:t>Yes</w:t>
             </w:r>
           </w:p>
         </w:tc>
@@ -10304,6 +10455,26 @@
                 <w:i w:val="0"/>
                 <w:sz w:val="17"/>
               </w:rPr>
+              <w:t>Yes</w:t>
+            </w:r>
+          </w:p>
+        </w:tc>
+        <w:tc>
+          <w:tcPr>
+            <w:tcW w:type="dxa" w:w="1560"/>
+          </w:tcPr>
+          <w:p>
+            <w:pPr>
+              <w:spacing w:line="240" w:lineRule="auto" w:before="20" w:after="20"/>
+            </w:pPr>
+            <w:r/>
+            <w:r>
+              <w:rPr>
+                <w:rFonts w:ascii="Times New Roman" w:hAnsi="Times New Roman"/>
+                <w:b w:val="0"/>
+                <w:i w:val="0"/>
+                <w:sz w:val="17"/>
+              </w:rPr>
               <w:t>0.02</w:t>
             </w:r>
           </w:p>
@@ -10345,26 +10516,6 @@
                 <w:sz w:val="17"/>
               </w:rPr>
               <w:t>0.0000</w:t>
-            </w:r>
-          </w:p>
-        </w:tc>
-        <w:tc>
-          <w:tcPr>
-            <w:tcW w:type="dxa" w:w="1560"/>
-          </w:tcPr>
-          <w:p>
-            <w:pPr>
-              <w:spacing w:line="240" w:lineRule="auto" w:before="20" w:after="20"/>
-            </w:pPr>
-            <w:r/>
-            <w:r>
-              <w:rPr>
-                <w:rFonts w:ascii="Times New Roman" w:hAnsi="Times New Roman"/>
-                <w:b w:val="0"/>
-                <w:i w:val="0"/>
-                <w:sz w:val="17"/>
-              </w:rPr>
-              <w:t>Yes</w:t>
             </w:r>
           </w:p>
         </w:tc>
@@ -10426,6 +10577,26 @@
                 <w:i w:val="0"/>
                 <w:sz w:val="17"/>
               </w:rPr>
+              <w:t>Yes</w:t>
+            </w:r>
+          </w:p>
+        </w:tc>
+        <w:tc>
+          <w:tcPr>
+            <w:tcW w:type="dxa" w:w="1560"/>
+          </w:tcPr>
+          <w:p>
+            <w:pPr>
+              <w:spacing w:line="240" w:lineRule="auto" w:before="20" w:after="20"/>
+            </w:pPr>
+            <w:r/>
+            <w:r>
+              <w:rPr>
+                <w:rFonts w:ascii="Times New Roman" w:hAnsi="Times New Roman"/>
+                <w:b w:val="0"/>
+                <w:i w:val="0"/>
+                <w:sz w:val="17"/>
+              </w:rPr>
               <w:t>0.02</w:t>
             </w:r>
           </w:p>
@@ -10467,26 +10638,6 @@
                 <w:sz w:val="17"/>
               </w:rPr>
               <w:t>0.0281</w:t>
-            </w:r>
-          </w:p>
-        </w:tc>
-        <w:tc>
-          <w:tcPr>
-            <w:tcW w:type="dxa" w:w="1560"/>
-          </w:tcPr>
-          <w:p>
-            <w:pPr>
-              <w:spacing w:line="240" w:lineRule="auto" w:before="20" w:after="20"/>
-            </w:pPr>
-            <w:r/>
-            <w:r>
-              <w:rPr>
-                <w:rFonts w:ascii="Times New Roman" w:hAnsi="Times New Roman"/>
-                <w:b w:val="0"/>
-                <w:i w:val="0"/>
-                <w:sz w:val="17"/>
-              </w:rPr>
-              <w:t>Yes</w:t>
             </w:r>
           </w:p>
         </w:tc>
@@ -10548,6 +10699,26 @@
                 <w:i w:val="0"/>
                 <w:sz w:val="17"/>
               </w:rPr>
+              <w:t>Yes</w:t>
+            </w:r>
+          </w:p>
+        </w:tc>
+        <w:tc>
+          <w:tcPr>
+            <w:tcW w:type="dxa" w:w="1560"/>
+          </w:tcPr>
+          <w:p>
+            <w:pPr>
+              <w:spacing w:line="240" w:lineRule="auto" w:before="20" w:after="20"/>
+            </w:pPr>
+            <w:r/>
+            <w:r>
+              <w:rPr>
+                <w:rFonts w:ascii="Times New Roman" w:hAnsi="Times New Roman"/>
+                <w:b w:val="0"/>
+                <w:i w:val="0"/>
+                <w:sz w:val="17"/>
+              </w:rPr>
               <w:t>0.00</w:t>
             </w:r>
           </w:p>
@@ -10589,26 +10760,6 @@
                 <w:sz w:val="17"/>
               </w:rPr>
               <w:t>0.0246</w:t>
-            </w:r>
-          </w:p>
-        </w:tc>
-        <w:tc>
-          <w:tcPr>
-            <w:tcW w:type="dxa" w:w="1560"/>
-          </w:tcPr>
-          <w:p>
-            <w:pPr>
-              <w:spacing w:line="240" w:lineRule="auto" w:before="20" w:after="20"/>
-            </w:pPr>
-            <w:r/>
-            <w:r>
-              <w:rPr>
-                <w:rFonts w:ascii="Times New Roman" w:hAnsi="Times New Roman"/>
-                <w:b w:val="0"/>
-                <w:i w:val="0"/>
-                <w:sz w:val="17"/>
-              </w:rPr>
-              <w:t>Yes</w:t>
             </w:r>
           </w:p>
         </w:tc>
@@ -10670,6 +10821,26 @@
                 <w:i w:val="0"/>
                 <w:sz w:val="17"/>
               </w:rPr>
+              <w:t>Yes</w:t>
+            </w:r>
+          </w:p>
+        </w:tc>
+        <w:tc>
+          <w:tcPr>
+            <w:tcW w:type="dxa" w:w="1560"/>
+          </w:tcPr>
+          <w:p>
+            <w:pPr>
+              <w:spacing w:line="240" w:lineRule="auto" w:before="20" w:after="20"/>
+            </w:pPr>
+            <w:r/>
+            <w:r>
+              <w:rPr>
+                <w:rFonts w:ascii="Times New Roman" w:hAnsi="Times New Roman"/>
+                <w:b w:val="0"/>
+                <w:i w:val="0"/>
+                <w:sz w:val="17"/>
+              </w:rPr>
               <w:t>0.11</w:t>
             </w:r>
           </w:p>
@@ -10711,26 +10882,6 @@
                 <w:sz w:val="17"/>
               </w:rPr>
               <w:t>0.0210</w:t>
-            </w:r>
-          </w:p>
-        </w:tc>
-        <w:tc>
-          <w:tcPr>
-            <w:tcW w:type="dxa" w:w="1560"/>
-          </w:tcPr>
-          <w:p>
-            <w:pPr>
-              <w:spacing w:line="240" w:lineRule="auto" w:before="20" w:after="20"/>
-            </w:pPr>
-            <w:r/>
-            <w:r>
-              <w:rPr>
-                <w:rFonts w:ascii="Times New Roman" w:hAnsi="Times New Roman"/>
-                <w:b w:val="0"/>
-                <w:i w:val="0"/>
-                <w:sz w:val="17"/>
-              </w:rPr>
-              <w:t>Yes</w:t>
             </w:r>
           </w:p>
         </w:tc>
@@ -10792,6 +10943,26 @@
                 <w:i w:val="0"/>
                 <w:sz w:val="17"/>
               </w:rPr>
+              <w:t>Yes</w:t>
+            </w:r>
+          </w:p>
+        </w:tc>
+        <w:tc>
+          <w:tcPr>
+            <w:tcW w:type="dxa" w:w="1560"/>
+          </w:tcPr>
+          <w:p>
+            <w:pPr>
+              <w:spacing w:line="240" w:lineRule="auto" w:before="20" w:after="20"/>
+            </w:pPr>
+            <w:r/>
+            <w:r>
+              <w:rPr>
+                <w:rFonts w:ascii="Times New Roman" w:hAnsi="Times New Roman"/>
+                <w:b w:val="0"/>
+                <w:i w:val="0"/>
+                <w:sz w:val="17"/>
+              </w:rPr>
               <w:t>0.00</w:t>
             </w:r>
           </w:p>
@@ -10833,26 +11004,6 @@
                 <w:sz w:val="17"/>
               </w:rPr>
               <w:t>0.0000</w:t>
-            </w:r>
-          </w:p>
-        </w:tc>
-        <w:tc>
-          <w:tcPr>
-            <w:tcW w:type="dxa" w:w="1560"/>
-          </w:tcPr>
-          <w:p>
-            <w:pPr>
-              <w:spacing w:line="240" w:lineRule="auto" w:before="20" w:after="20"/>
-            </w:pPr>
-            <w:r/>
-            <w:r>
-              <w:rPr>
-                <w:rFonts w:ascii="Times New Roman" w:hAnsi="Times New Roman"/>
-                <w:b w:val="0"/>
-                <w:i w:val="0"/>
-                <w:sz w:val="17"/>
-              </w:rPr>
-              <w:t>Yes</w:t>
             </w:r>
           </w:p>
         </w:tc>
@@ -10914,6 +11065,26 @@
                 <w:i w:val="0"/>
                 <w:sz w:val="17"/>
               </w:rPr>
+              <w:t>Yes</w:t>
+            </w:r>
+          </w:p>
+        </w:tc>
+        <w:tc>
+          <w:tcPr>
+            <w:tcW w:type="dxa" w:w="1560"/>
+          </w:tcPr>
+          <w:p>
+            <w:pPr>
+              <w:spacing w:line="240" w:lineRule="auto" w:before="20" w:after="20"/>
+            </w:pPr>
+            <w:r/>
+            <w:r>
+              <w:rPr>
+                <w:rFonts w:ascii="Times New Roman" w:hAnsi="Times New Roman"/>
+                <w:b w:val="0"/>
+                <w:i w:val="0"/>
+                <w:sz w:val="17"/>
+              </w:rPr>
               <w:t>0.17</w:t>
             </w:r>
           </w:p>
@@ -10955,26 +11126,6 @@
                 <w:sz w:val="17"/>
               </w:rPr>
               <w:t>0.0130</w:t>
-            </w:r>
-          </w:p>
-        </w:tc>
-        <w:tc>
-          <w:tcPr>
-            <w:tcW w:type="dxa" w:w="1560"/>
-          </w:tcPr>
-          <w:p>
-            <w:pPr>
-              <w:spacing w:line="240" w:lineRule="auto" w:before="20" w:after="20"/>
-            </w:pPr>
-            <w:r/>
-            <w:r>
-              <w:rPr>
-                <w:rFonts w:ascii="Times New Roman" w:hAnsi="Times New Roman"/>
-                <w:b w:val="0"/>
-                <w:i w:val="0"/>
-                <w:sz w:val="17"/>
-              </w:rPr>
-              <w:t>Yes</w:t>
             </w:r>
           </w:p>
         </w:tc>
@@ -11036,6 +11187,26 @@
                 <w:i w:val="0"/>
                 <w:sz w:val="17"/>
               </w:rPr>
+              <w:t>Yes</w:t>
+            </w:r>
+          </w:p>
+        </w:tc>
+        <w:tc>
+          <w:tcPr>
+            <w:tcW w:type="dxa" w:w="1560"/>
+          </w:tcPr>
+          <w:p>
+            <w:pPr>
+              <w:spacing w:line="240" w:lineRule="auto" w:before="20" w:after="20"/>
+            </w:pPr>
+            <w:r/>
+            <w:r>
+              <w:rPr>
+                <w:rFonts w:ascii="Times New Roman" w:hAnsi="Times New Roman"/>
+                <w:b w:val="0"/>
+                <w:i w:val="0"/>
+                <w:sz w:val="17"/>
+              </w:rPr>
               <w:t>0.02</w:t>
             </w:r>
           </w:p>
@@ -11077,26 +11248,6 @@
                 <w:sz w:val="17"/>
               </w:rPr>
               <w:t>0.0531</w:t>
-            </w:r>
-          </w:p>
-        </w:tc>
-        <w:tc>
-          <w:tcPr>
-            <w:tcW w:type="dxa" w:w="1560"/>
-          </w:tcPr>
-          <w:p>
-            <w:pPr>
-              <w:spacing w:line="240" w:lineRule="auto" w:before="20" w:after="20"/>
-            </w:pPr>
-            <w:r/>
-            <w:r>
-              <w:rPr>
-                <w:rFonts w:ascii="Times New Roman" w:hAnsi="Times New Roman"/>
-                <w:b w:val="0"/>
-                <w:i w:val="0"/>
-                <w:sz w:val="17"/>
-              </w:rPr>
-              <w:t>Yes</w:t>
             </w:r>
           </w:p>
         </w:tc>
@@ -11158,6 +11309,26 @@
                 <w:i w:val="0"/>
                 <w:sz w:val="17"/>
               </w:rPr>
+              <w:t>Yes</w:t>
+            </w:r>
+          </w:p>
+        </w:tc>
+        <w:tc>
+          <w:tcPr>
+            <w:tcW w:type="dxa" w:w="1560"/>
+          </w:tcPr>
+          <w:p>
+            <w:pPr>
+              <w:spacing w:line="240" w:lineRule="auto" w:before="20" w:after="20"/>
+            </w:pPr>
+            <w:r/>
+            <w:r>
+              <w:rPr>
+                <w:rFonts w:ascii="Times New Roman" w:hAnsi="Times New Roman"/>
+                <w:b w:val="0"/>
+                <w:i w:val="0"/>
+                <w:sz w:val="17"/>
+              </w:rPr>
               <w:t>0.26</w:t>
             </w:r>
           </w:p>
@@ -11199,26 +11370,6 @@
                 <w:sz w:val="17"/>
               </w:rPr>
               <w:t>0.0000</w:t>
-            </w:r>
-          </w:p>
-        </w:tc>
-        <w:tc>
-          <w:tcPr>
-            <w:tcW w:type="dxa" w:w="1560"/>
-          </w:tcPr>
-          <w:p>
-            <w:pPr>
-              <w:spacing w:line="240" w:lineRule="auto" w:before="20" w:after="20"/>
-            </w:pPr>
-            <w:r/>
-            <w:r>
-              <w:rPr>
-                <w:rFonts w:ascii="Times New Roman" w:hAnsi="Times New Roman"/>
-                <w:b w:val="0"/>
-                <w:i w:val="0"/>
-                <w:sz w:val="17"/>
-              </w:rPr>
-              <w:t>Yes</w:t>
             </w:r>
           </w:p>
         </w:tc>
@@ -11280,6 +11431,26 @@
                 <w:i w:val="0"/>
                 <w:sz w:val="17"/>
               </w:rPr>
+              <w:t>No</w:t>
+            </w:r>
+          </w:p>
+        </w:tc>
+        <w:tc>
+          <w:tcPr>
+            <w:tcW w:type="dxa" w:w="1560"/>
+          </w:tcPr>
+          <w:p>
+            <w:pPr>
+              <w:spacing w:line="240" w:lineRule="auto" w:before="20" w:after="20"/>
+            </w:pPr>
+            <w:r/>
+            <w:r>
+              <w:rPr>
+                <w:rFonts w:ascii="Times New Roman" w:hAnsi="Times New Roman"/>
+                <w:b w:val="0"/>
+                <w:i w:val="0"/>
+                <w:sz w:val="17"/>
+              </w:rPr>
               <w:t>0.02</w:t>
             </w:r>
           </w:p>
@@ -11321,26 +11492,6 @@
                 <w:sz w:val="17"/>
               </w:rPr>
               <w:t>0.0000</w:t>
-            </w:r>
-          </w:p>
-        </w:tc>
-        <w:tc>
-          <w:tcPr>
-            <w:tcW w:type="dxa" w:w="1560"/>
-          </w:tcPr>
-          <w:p>
-            <w:pPr>
-              <w:spacing w:line="240" w:lineRule="auto" w:before="20" w:after="20"/>
-            </w:pPr>
-            <w:r/>
-            <w:r>
-              <w:rPr>
-                <w:rFonts w:ascii="Times New Roman" w:hAnsi="Times New Roman"/>
-                <w:b w:val="0"/>
-                <w:i w:val="0"/>
-                <w:sz w:val="17"/>
-              </w:rPr>
-              <w:t>No</w:t>
             </w:r>
           </w:p>
         </w:tc>
@@ -11402,6 +11553,26 @@
                 <w:i w:val="0"/>
                 <w:sz w:val="17"/>
               </w:rPr>
+              <w:t>Yes</w:t>
+            </w:r>
+          </w:p>
+        </w:tc>
+        <w:tc>
+          <w:tcPr>
+            <w:tcW w:type="dxa" w:w="1560"/>
+          </w:tcPr>
+          <w:p>
+            <w:pPr>
+              <w:spacing w:line="240" w:lineRule="auto" w:before="20" w:after="20"/>
+            </w:pPr>
+            <w:r/>
+            <w:r>
+              <w:rPr>
+                <w:rFonts w:ascii="Times New Roman" w:hAnsi="Times New Roman"/>
+                <w:b w:val="0"/>
+                <w:i w:val="0"/>
+                <w:sz w:val="17"/>
+              </w:rPr>
               <w:t>0.02</w:t>
             </w:r>
           </w:p>
@@ -11443,26 +11614,6 @@
                 <w:sz w:val="17"/>
               </w:rPr>
               <w:t>0.0000</w:t>
-            </w:r>
-          </w:p>
-        </w:tc>
-        <w:tc>
-          <w:tcPr>
-            <w:tcW w:type="dxa" w:w="1560"/>
-          </w:tcPr>
-          <w:p>
-            <w:pPr>
-              <w:spacing w:line="240" w:lineRule="auto" w:before="20" w:after="20"/>
-            </w:pPr>
-            <w:r/>
-            <w:r>
-              <w:rPr>
-                <w:rFonts w:ascii="Times New Roman" w:hAnsi="Times New Roman"/>
-                <w:b w:val="0"/>
-                <w:i w:val="0"/>
-                <w:sz w:val="17"/>
-              </w:rPr>
-              <w:t>Yes</w:t>
             </w:r>
           </w:p>
         </w:tc>
@@ -11524,6 +11675,26 @@
                 <w:i w:val="0"/>
                 <w:sz w:val="17"/>
               </w:rPr>
+              <w:t>No</w:t>
+            </w:r>
+          </w:p>
+        </w:tc>
+        <w:tc>
+          <w:tcPr>
+            <w:tcW w:type="dxa" w:w="1560"/>
+          </w:tcPr>
+          <w:p>
+            <w:pPr>
+              <w:spacing w:line="240" w:lineRule="auto" w:before="20" w:after="20"/>
+            </w:pPr>
+            <w:r/>
+            <w:r>
+              <w:rPr>
+                <w:rFonts w:ascii="Times New Roman" w:hAnsi="Times New Roman"/>
+                <w:b w:val="0"/>
+                <w:i w:val="0"/>
+                <w:sz w:val="17"/>
+              </w:rPr>
               <w:t>0.17</w:t>
             </w:r>
           </w:p>
@@ -11565,26 +11736,6 @@
                 <w:sz w:val="17"/>
               </w:rPr>
               <w:t>0.0083</w:t>
-            </w:r>
-          </w:p>
-        </w:tc>
-        <w:tc>
-          <w:tcPr>
-            <w:tcW w:type="dxa" w:w="1560"/>
-          </w:tcPr>
-          <w:p>
-            <w:pPr>
-              <w:spacing w:line="240" w:lineRule="auto" w:before="20" w:after="20"/>
-            </w:pPr>
-            <w:r/>
-            <w:r>
-              <w:rPr>
-                <w:rFonts w:ascii="Times New Roman" w:hAnsi="Times New Roman"/>
-                <w:b w:val="0"/>
-                <w:i w:val="0"/>
-                <w:sz w:val="17"/>
-              </w:rPr>
-              <w:t>No</w:t>
             </w:r>
           </w:p>
         </w:tc>
@@ -11646,6 +11797,26 @@
                 <w:i w:val="0"/>
                 <w:sz w:val="17"/>
               </w:rPr>
+              <w:t>Yes</w:t>
+            </w:r>
+          </w:p>
+        </w:tc>
+        <w:tc>
+          <w:tcPr>
+            <w:tcW w:type="dxa" w:w="1560"/>
+          </w:tcPr>
+          <w:p>
+            <w:pPr>
+              <w:spacing w:line="240" w:lineRule="auto" w:before="20" w:after="20"/>
+            </w:pPr>
+            <w:r/>
+            <w:r>
+              <w:rPr>
+                <w:rFonts w:ascii="Times New Roman" w:hAnsi="Times New Roman"/>
+                <w:b w:val="0"/>
+                <w:i w:val="0"/>
+                <w:sz w:val="17"/>
+              </w:rPr>
               <w:t>0.07</w:t>
             </w:r>
           </w:p>
@@ -11687,26 +11858,6 @@
                 <w:sz w:val="17"/>
               </w:rPr>
               <w:t>0.0216</w:t>
-            </w:r>
-          </w:p>
-        </w:tc>
-        <w:tc>
-          <w:tcPr>
-            <w:tcW w:type="dxa" w:w="1560"/>
-          </w:tcPr>
-          <w:p>
-            <w:pPr>
-              <w:spacing w:line="240" w:lineRule="auto" w:before="20" w:after="20"/>
-            </w:pPr>
-            <w:r/>
-            <w:r>
-              <w:rPr>
-                <w:rFonts w:ascii="Times New Roman" w:hAnsi="Times New Roman"/>
-                <w:b w:val="0"/>
-                <w:i w:val="0"/>
-                <w:sz w:val="17"/>
-              </w:rPr>
-              <w:t>Yes</w:t>
             </w:r>
           </w:p>
         </w:tc>
@@ -11768,6 +11919,26 @@
                 <w:i w:val="0"/>
                 <w:sz w:val="17"/>
               </w:rPr>
+              <w:t>Yes</w:t>
+            </w:r>
+          </w:p>
+        </w:tc>
+        <w:tc>
+          <w:tcPr>
+            <w:tcW w:type="dxa" w:w="1560"/>
+          </w:tcPr>
+          <w:p>
+            <w:pPr>
+              <w:spacing w:line="240" w:lineRule="auto" w:before="20" w:after="20"/>
+            </w:pPr>
+            <w:r/>
+            <w:r>
+              <w:rPr>
+                <w:rFonts w:ascii="Times New Roman" w:hAnsi="Times New Roman"/>
+                <w:b w:val="0"/>
+                <w:i w:val="0"/>
+                <w:sz w:val="17"/>
+              </w:rPr>
               <w:t>0.00</w:t>
             </w:r>
           </w:p>
@@ -11809,26 +11980,6 @@
                 <w:sz w:val="17"/>
               </w:rPr>
               <w:t>0.0000</w:t>
-            </w:r>
-          </w:p>
-        </w:tc>
-        <w:tc>
-          <w:tcPr>
-            <w:tcW w:type="dxa" w:w="1560"/>
-          </w:tcPr>
-          <w:p>
-            <w:pPr>
-              <w:spacing w:line="240" w:lineRule="auto" w:before="20" w:after="20"/>
-            </w:pPr>
-            <w:r/>
-            <w:r>
-              <w:rPr>
-                <w:rFonts w:ascii="Times New Roman" w:hAnsi="Times New Roman"/>
-                <w:b w:val="0"/>
-                <w:i w:val="0"/>
-                <w:sz w:val="17"/>
-              </w:rPr>
-              <w:t>Yes</w:t>
             </w:r>
           </w:p>
         </w:tc>
@@ -11890,6 +12041,26 @@
                 <w:i w:val="0"/>
                 <w:sz w:val="17"/>
               </w:rPr>
+              <w:t>No</w:t>
+            </w:r>
+          </w:p>
+        </w:tc>
+        <w:tc>
+          <w:tcPr>
+            <w:tcW w:type="dxa" w:w="1560"/>
+          </w:tcPr>
+          <w:p>
+            <w:pPr>
+              <w:spacing w:line="240" w:lineRule="auto" w:before="20" w:after="20"/>
+            </w:pPr>
+            <w:r/>
+            <w:r>
+              <w:rPr>
+                <w:rFonts w:ascii="Times New Roman" w:hAnsi="Times New Roman"/>
+                <w:b w:val="0"/>
+                <w:i w:val="0"/>
+                <w:sz w:val="17"/>
+              </w:rPr>
               <w:t>0.71</w:t>
             </w:r>
           </w:p>
@@ -11931,26 +12102,6 @@
                 <w:sz w:val="17"/>
               </w:rPr>
               <w:t>0.0335</w:t>
-            </w:r>
-          </w:p>
-        </w:tc>
-        <w:tc>
-          <w:tcPr>
-            <w:tcW w:type="dxa" w:w="1560"/>
-          </w:tcPr>
-          <w:p>
-            <w:pPr>
-              <w:spacing w:line="240" w:lineRule="auto" w:before="20" w:after="20"/>
-            </w:pPr>
-            <w:r/>
-            <w:r>
-              <w:rPr>
-                <w:rFonts w:ascii="Times New Roman" w:hAnsi="Times New Roman"/>
-                <w:b w:val="0"/>
-                <w:i w:val="0"/>
-                <w:sz w:val="17"/>
-              </w:rPr>
-              <w:t>No</w:t>
             </w:r>
           </w:p>
         </w:tc>

</xml_diff>

<commit_message>
MVP PLOS ONE v1.8.0 -- Round-17 single numeric correction
Round-17 enforced-independence four-expert review (A1-A4, fresh, no prior-round
reading) independently recomputed all DAM / Table-3 / P6 / translation / OXPHOS
claims from artifact CSVs; 0 scientific blocker. One binding numeric defect:

- REG3B nerve-injury-only FDR corrected 2.1e-20 -> 3.18e-20 (manuscript L78 now
  matches authoritative _R4_nerveinjury_only_meta.csv FDR_NI = 3.177e-20; the
  2.1e-20 had no source in any artifact). Six-input REG3B FDR (1.38e-13) unchanged.

Non-blocking: P2RX phrasing clarified 'permutation p = 0.56 in the six-input meta'
to disambiguate Stouffer p (0.04) from the permutation p the honest-null rests on.

Version markers (manuscript, CITATION.cff, README, cover letter, compliance) v1.7.0 -> v1.8.0.
Rebuilt Manuscript.docx; gates green (p7 70 checks, gate_consistency 57, verify_sr_docx 47).
</commit_message>
<xml_diff>
--- a/submission_pack/Manuscript.docx
+++ b/submission_pack/Manuscript.docx
@@ -783,7 +783,7 @@
           <w:i w:val="0"/>
           <w:sz w:val="22"/>
         </w:rPr>
-        <w:t>Not every hub carries prior pain/DRG evidence, and several are annotation outliers that we flag rather than conceal. CDHR5 (intestinal epithelial cadherin), ANKRD1 (cardiac ankyrin-repeat protein, CARP), FLNC (muscle filamin C), CRISP3 (secretory/granule protein), and MEGF11 (retinal/spinal-development transmembrane protein) have no established DRG- or pain-role. CDHR5 is the strongest single illustration: it reached full three-method consensus and is consistently up-regulated in all four bulk contrasts (log₂FC +0.07 to +2.62, the largest contribution coming from GSE278227), so it is not a single-study artefact, yet its annotated biology is intestinal-epithelial and no DRG or pain role is established, we therefore treat it as a watch-list annotation outlier pending orthogonal confirmation rather than as a finding or biological candidate. Among hubs with established DRG-injury or pain evidence are ATF3, SPRR1A, ECEL1, NPY and VIP. REG3B — whose "established DRG neuroimmune hub" status derives largely from a single CRPS-I report¹⁹ (not CPSP, not nerve-transection) — is meta-significant in the present analysis (1.38×10⁻¹³; nerve-injury-only FDR 2.1×10⁻²⁰) yet fails the core's direction-consistency gate (consistency 0.75; down in 1 of 4 contrasts) and was not localisable in spinal snRNA and only 1.7% detected in DRG; we therefore carry it as an external motivational hypothesis rather than as a core internal hub, and it must be tested in the present model before weight is attached.</w:t>
+        <w:t>Not every hub carries prior pain/DRG evidence, and several are annotation outliers that we flag rather than conceal. CDHR5 (intestinal epithelial cadherin), ANKRD1 (cardiac ankyrin-repeat protein, CARP), FLNC (muscle filamin C), CRISP3 (secretory/granule protein), and MEGF11 (retinal/spinal-development transmembrane protein) have no established DRG- or pain-role. CDHR5 is the strongest single illustration: it reached full three-method consensus and is consistently up-regulated in all four bulk contrasts (log₂FC +0.07 to +2.62, the largest contribution coming from GSE278227), so it is not a single-study artefact, yet its annotated biology is intestinal-epithelial and no DRG or pain role is established, we therefore treat it as a watch-list annotation outlier pending orthogonal confirmation rather than as a finding or biological candidate. Among hubs with established DRG-injury or pain evidence are ATF3, SPRR1A, ECEL1, NPY and VIP. REG3B — whose "established DRG neuroimmune hub" status derives largely from a single CRPS-I report¹⁹ (not CPSP, not nerve-transection) — is meta-significant in the present analysis (1.38×10⁻¹³; nerve-injury-only FDR 3.18×10⁻²⁰) yet fails the core's direction-consistency gate (consistency 0.75; down in 1 of 4 contrasts) and was not localisable in spinal snRNA and only 1.7% detected in DRG; we therefore carry it as an external motivational hypothesis rather than as a core internal hub, and it must be tested in the present model before weight is attached.</w:t>
       </w:r>
     </w:p>
     <w:p>
@@ -797,7 +797,7 @@
           <w:i w:val="0"/>
           <w:sz w:val="22"/>
         </w:rPr>
-        <w:t>In the present meta-analysis the purinergic family was itself negative: P2RX/P2RY showed no coordinate change (permutation p = 0.339 in the bulk-only meta; p = 0.56 in the six-input meta). We note this explicitly because the broader literature links microglial P2X4 to neuropathic pain²⁰; the absence of a P2RX/P2RY signal here implies that the DAM-like state captured is only partially the classic P2X4-driven microglial activation described in that literature, and single-cell work after peripheral nerve injury likewise reports only partial, time- and sex-specific overlap with the canonical DAM programme²¹. This is informative about the limits of the axis rather than a contradiction of the literature, and it is one reason we describe the neuroimmune signal as 'DAM-like' rather than as a fully reconstituted DAM state. The clearest single-gene exception to the ion-channel-family nulls is the gabapentinoid target itself: CACNA2D1 (α2δ-1) was up-regulated in 4 of 6 contrasts (meta_Z +7.09, meta_FDR 2.3 × 10⁻¹⁰, consistency 4/6), i.e. the present meta independently reproduces the injury-induced α2δ-1 up-regulation that underlies gabapentinoid efficacy²² (in the SMIR model gabapentin reverses SMIR-evoked hypersensitivity²³), while the family-wide CACNA test remains null because its other 17 members do not move coordinately. The ion-channel statement is therefore a family-level statement, and the single most clinically actionable ion-channel-adjacent gene in this dataset is up-regulated, not null.</w:t>
+        <w:t>In the present meta-analysis the purinergic family was itself negative: P2RX/P2RY showed no coordinate change (permutation p = 0.339 in the bulk-only meta; permutation p = 0.56 in the six-input meta). We note this explicitly because the broader literature links microglial P2X4 to neuropathic pain²⁰; the absence of a P2RX/P2RY signal here implies that the DAM-like state captured is only partially the classic P2X4-driven microglial activation described in that literature, and single-cell work after peripheral nerve injury likewise reports only partial, time- and sex-specific overlap with the canonical DAM programme²¹. This is informative about the limits of the axis rather than a contradiction of the literature, and it is one reason we describe the neuroimmune signal as 'DAM-like' rather than as a fully reconstituted DAM state. The clearest single-gene exception to the ion-channel-family nulls is the gabapentinoid target itself: CACNA2D1 (α2δ-1) was up-regulated in 4 of 6 contrasts (meta_Z +7.09, meta_FDR 2.3 × 10⁻¹⁰, consistency 4/6), i.e. the present meta independently reproduces the injury-induced α2δ-1 up-regulation that underlies gabapentinoid efficacy²² (in the SMIR model gabapentin reverses SMIR-evoked hypersensitivity²³), while the family-wide CACNA test remains null because its other 17 members do not move coordinately. The ion-channel statement is therefore a family-level statement, and the single most clinically actionable ion-channel-adjacent gene in this dataset is up-regulated, not null.</w:t>
       </w:r>
     </w:p>
     <w:p>
@@ -5952,7 +5952,7 @@
           <w:i w:val="0"/>
           <w:sz w:val="22"/>
         </w:rPr>
-        <w:t xml:space="preserve">All code, tables and figures are version-controlled in the public GitHub repository at https://github.com/yyx-4113/cpsp-drg-spinal-repurposing. The 12 primary GEO accessions analysed here (GSE267799, GSE212311, GSE278227, GSE241361, GSE265957, GSE158825, GSE222979, GSE216039, GSE328175, GSE246288, GSE306403, GSE325938) are public and available from GEO. At submission the repository is released as version v1.7.0 (README + CITATION.cff + MIT LICENSE + reproduction scripts), and the derived tables enumerated below are included in that release: meta-analysis tables, gene-set statistics with set-level correction, hub lists, docking scores, single-cell/spatial localisation tables, the bulk-only sensitivity output </w:t>
+        <w:t xml:space="preserve">All code, tables and figures are version-controlled in the public GitHub repository at https://github.com/yyx-4113/cpsp-drg-spinal-repurposing. The 12 primary GEO accessions analysed here (GSE267799, GSE212311, GSE278227, GSE241361, GSE265957, GSE158825, GSE222979, GSE216039, GSE328175, GSE246288, GSE306403, GSE325938) are public and available from GEO. At submission the repository is released as version v1.8.0 (README + CITATION.cff + MIT LICENSE + reproduction scripts), and the derived tables enumerated below are included in that release: meta-analysis tables, gene-set statistics with set-level correction, hub lists, docking scores, single-cell/spatial localisation tables, the bulk-only sensitivity output </w:t>
       </w:r>
       <w:r>
         <w:rPr>
@@ -6092,7 +6092,7 @@
           <w:i w:val="0"/>
           <w:sz w:val="22"/>
         </w:rPr>
-        <w:t>The GitHub repository referenced above is released as a versioned, citable archive (v1.7.0; integrity verifiable via the accompanying CITATION.cff and the immutable version tag); no Zenodo snapshot has been deposited. Data are therefore available from the versioned GitHub release, not on request.</w:t>
+        <w:t>The GitHub repository referenced above is released as a versioned, citable archive (v1.8.0; integrity verifiable via the accompanying CITATION.cff and the immutable version tag); no Zenodo snapshot has been deposited. Data are therefore available from the versioned GitHub release, not on request.</w:t>
       </w:r>
     </w:p>
     <w:p>

</xml_diff>